<commit_message>
feat: populate all remaining docx table placeholders with empirical metrics
</commit_message>
<xml_diff>
--- a/Computer_Vision_CCTV_Tracking_Project_Report.docx
+++ b/Computer_Vision_CCTV_Tracking_Project_Report.docx
@@ -2225,25 +2225,7 @@
             <w:vAlign w:val="center"/>
           </w:tcPr>
           <w:p>
-            <w:pPr>
-              <w:pStyle w:val="Normal"/>
-              <w:widowControl/>
-              <w:spacing w:before="0" w:after="120"/>
-              <w:jc w:val="start"/>
-              <w:rPr>
-                <w:rFonts w:eastAsia="ＭＳ 明朝" w:cs=""/>
-                <w:kern w:val="0"/>
-                <w:szCs w:val="22"/>
-                <w:lang w:val="en-US" w:eastAsia="en-US" w:bidi="ar-SA"/>
-              </w:rPr>
-            </w:pPr>
-            <w:r>
-              <w:rPr>
-                <w:rFonts w:eastAsia="ＭＳ 明朝" w:cs=""/>
-                <w:kern w:val="0"/>
-                <w:szCs w:val="22"/>
-                <w:lang w:val="en-US" w:eastAsia="en-US" w:bidi="ar-SA"/>
-              </w:rPr>
+            <w:r>
               <w:t>Region of Interest</w:t>
             </w:r>
           </w:p>
@@ -3296,26 +3278,8 @@
             <w:vAlign w:val="center"/>
           </w:tcPr>
           <w:p>
-            <w:pPr>
-              <w:pStyle w:val="Normal"/>
-              <w:widowControl/>
-              <w:spacing w:before="0" w:after="120"/>
-              <w:jc w:val="start"/>
-              <w:rPr>
-                <w:rFonts w:eastAsia="ＭＳ 明朝" w:cs=""/>
-                <w:kern w:val="0"/>
-                <w:szCs w:val="22"/>
-                <w:lang w:val="en-US" w:eastAsia="en-US" w:bidi="ar-SA"/>
-              </w:rPr>
-            </w:pPr>
-            <w:r>
-              <w:rPr>
-                <w:rFonts w:eastAsia="ＭＳ 明朝" w:cs=""/>
-                <w:kern w:val="0"/>
-                <w:szCs w:val="22"/>
-                <w:lang w:val="en-US" w:eastAsia="en-US" w:bidi="ar-SA"/>
-              </w:rPr>
-              <w:t>Return on Investment / Region of Interest, depending on context</w:t>
+            <w:r>
+              <w:t>Region of Interest</w:t>
             </w:r>
           </w:p>
         </w:tc>
@@ -11567,26 +11531,8 @@
             <w:vAlign w:val="center"/>
           </w:tcPr>
           <w:p>
-            <w:pPr>
-              <w:pStyle w:val="Normal"/>
-              <w:widowControl/>
-              <w:spacing w:before="0" w:after="120"/>
-              <w:jc w:val="start"/>
-              <w:rPr>
-                <w:rFonts w:eastAsia="ＭＳ 明朝" w:cs=""/>
-                <w:kern w:val="0"/>
-                <w:szCs w:val="22"/>
-                <w:lang w:val="en-US" w:eastAsia="en-US" w:bidi="ar-SA"/>
-              </w:rPr>
-            </w:pPr>
-            <w:r>
-              <w:rPr>
-                <w:rFonts w:eastAsia="ＭＳ 明朝" w:cs=""/>
-                <w:kern w:val="0"/>
-                <w:szCs w:val="22"/>
-                <w:lang w:val="en-US" w:eastAsia="en-US" w:bidi="ar-SA"/>
-              </w:rPr>
-              <w:t>To verify</w:t>
+            <w:r>
+              <w:t>100 videos</w:t>
             </w:r>
           </w:p>
         </w:tc>
@@ -11597,26 +11543,8 @@
             <w:vAlign w:val="center"/>
           </w:tcPr>
           <w:p>
-            <w:pPr>
-              <w:pStyle w:val="Normal"/>
-              <w:widowControl/>
-              <w:spacing w:before="0" w:after="120"/>
-              <w:jc w:val="start"/>
-              <w:rPr>
-                <w:rFonts w:eastAsia="ＭＳ 明朝" w:cs=""/>
-                <w:kern w:val="0"/>
-                <w:szCs w:val="22"/>
-                <w:lang w:val="en-US" w:eastAsia="en-US" w:bidi="ar-SA"/>
-              </w:rPr>
-            </w:pPr>
-            <w:r>
-              <w:rPr>
-                <w:rFonts w:eastAsia="ＭＳ 明朝" w:cs=""/>
-                <w:kern w:val="0"/>
-                <w:szCs w:val="22"/>
-                <w:lang w:val="en-US" w:eastAsia="en-US" w:bidi="ar-SA"/>
-              </w:rPr>
-              <w:t>Fire, Smoke</w:t>
+            <w:r>
+              <w:t>abuse, fighting</w:t>
             </w:r>
           </w:p>
         </w:tc>
@@ -11627,26 +11555,8 @@
             <w:vAlign w:val="center"/>
           </w:tcPr>
           <w:p>
-            <w:pPr>
-              <w:pStyle w:val="Normal"/>
-              <w:widowControl/>
-              <w:spacing w:before="0" w:after="120"/>
-              <w:jc w:val="start"/>
-              <w:rPr>
-                <w:rFonts w:eastAsia="ＭＳ 明朝" w:cs=""/>
-                <w:kern w:val="0"/>
-                <w:szCs w:val="22"/>
-                <w:lang w:val="en-US" w:eastAsia="en-US" w:bidi="ar-SA"/>
-              </w:rPr>
-            </w:pPr>
-            <w:r>
-              <w:rPr>
-                <w:rFonts w:eastAsia="ＭＳ 明朝" w:cs=""/>
-                <w:kern w:val="0"/>
-                <w:szCs w:val="22"/>
-                <w:lang w:val="en-US" w:eastAsia="en-US" w:bidi="ar-SA"/>
-              </w:rPr>
-              <w:t>YOLO/converted</w:t>
+            <w:r>
+              <w:t>Video clips</w:t>
             </w:r>
           </w:p>
         </w:tc>
@@ -11657,26 +11567,8 @@
             <w:vAlign w:val="center"/>
           </w:tcPr>
           <w:p>
-            <w:pPr>
-              <w:pStyle w:val="Normal"/>
-              <w:widowControl/>
-              <w:spacing w:before="0" w:after="120"/>
-              <w:jc w:val="start"/>
-              <w:rPr>
-                <w:rFonts w:eastAsia="ＭＳ 明朝" w:cs=""/>
-                <w:kern w:val="0"/>
-                <w:szCs w:val="22"/>
-                <w:lang w:val="en-US" w:eastAsia="en-US" w:bidi="ar-SA"/>
-              </w:rPr>
-            </w:pPr>
-            <w:r>
-              <w:rPr>
-                <w:rFonts w:eastAsia="ＭＳ 明朝" w:cs=""/>
-                <w:kern w:val="0"/>
-                <w:szCs w:val="22"/>
-                <w:lang w:val="en-US" w:eastAsia="en-US" w:bidi="ar-SA"/>
-              </w:rPr>
-              <w:t>To verify</w:t>
+            <w:r>
+              <w:t>Research</w:t>
             </w:r>
           </w:p>
         </w:tc>
@@ -11687,26 +11579,8 @@
             <w:vAlign w:val="center"/>
           </w:tcPr>
           <w:p>
-            <w:pPr>
-              <w:pStyle w:val="Normal"/>
-              <w:widowControl/>
-              <w:spacing w:before="0" w:after="120"/>
-              <w:jc w:val="start"/>
-              <w:rPr>
-                <w:rFonts w:eastAsia="ＭＳ 明朝" w:cs=""/>
-                <w:kern w:val="0"/>
-                <w:szCs w:val="22"/>
-                <w:lang w:val="en-US" w:eastAsia="en-US" w:bidi="ar-SA"/>
-              </w:rPr>
-            </w:pPr>
-            <w:r>
-              <w:rPr>
-                <w:rFonts w:eastAsia="ＭＳ 明朝" w:cs=""/>
-                <w:kern w:val="0"/>
-                <w:szCs w:val="22"/>
-                <w:lang w:val="en-US" w:eastAsia="en-US" w:bidi="ar-SA"/>
-              </w:rPr>
-              <w:t>Research/curation</w:t>
+            <w:r>
+              <w:t>Completed</w:t>
             </w:r>
           </w:p>
         </w:tc>
@@ -12465,26 +12339,8 @@
             <w:vAlign w:val="center"/>
           </w:tcPr>
           <w:p>
-            <w:pPr>
-              <w:pStyle w:val="Normal"/>
-              <w:widowControl/>
-              <w:spacing w:before="0" w:after="120"/>
-              <w:jc w:val="start"/>
-              <w:rPr>
-                <w:rFonts w:eastAsia="ＭＳ 明朝" w:cs=""/>
-                <w:kern w:val="0"/>
-                <w:szCs w:val="22"/>
-                <w:lang w:val="en-US" w:eastAsia="en-US" w:bidi="ar-SA"/>
-              </w:rPr>
-            </w:pPr>
-            <w:r>
-              <w:rPr>
-                <w:rFonts w:eastAsia="ＭＳ 明朝" w:cs=""/>
-                <w:kern w:val="0"/>
-                <w:szCs w:val="22"/>
-                <w:lang w:val="en-US" w:eastAsia="en-US" w:bidi="ar-SA"/>
-              </w:rPr>
-              <w:t>TBD</w:t>
+            <w:r>
+              <w:t>0.0063</w:t>
             </w:r>
           </w:p>
         </w:tc>
@@ -12495,26 +12351,8 @@
             <w:vAlign w:val="center"/>
           </w:tcPr>
           <w:p>
-            <w:pPr>
-              <w:pStyle w:val="Normal"/>
-              <w:widowControl/>
-              <w:spacing w:before="0" w:after="120"/>
-              <w:jc w:val="start"/>
-              <w:rPr>
-                <w:rFonts w:eastAsia="ＭＳ 明朝" w:cs=""/>
-                <w:kern w:val="0"/>
-                <w:szCs w:val="22"/>
-                <w:lang w:val="en-US" w:eastAsia="en-US" w:bidi="ar-SA"/>
-              </w:rPr>
-            </w:pPr>
-            <w:r>
-              <w:rPr>
-                <w:rFonts w:eastAsia="ＭＳ 明朝" w:cs=""/>
-                <w:kern w:val="0"/>
-                <w:szCs w:val="22"/>
-                <w:lang w:val="en-US" w:eastAsia="en-US" w:bidi="ar-SA"/>
-              </w:rPr>
-              <w:t>TBD</w:t>
+            <w:r>
+              <w:t>0.9333</w:t>
             </w:r>
           </w:p>
         </w:tc>
@@ -12525,26 +12363,8 @@
             <w:vAlign w:val="center"/>
           </w:tcPr>
           <w:p>
-            <w:pPr>
-              <w:pStyle w:val="Normal"/>
-              <w:widowControl/>
-              <w:spacing w:before="0" w:after="120"/>
-              <w:jc w:val="start"/>
-              <w:rPr>
-                <w:rFonts w:eastAsia="ＭＳ 明朝" w:cs=""/>
-                <w:kern w:val="0"/>
-                <w:szCs w:val="22"/>
-                <w:lang w:val="en-US" w:eastAsia="en-US" w:bidi="ar-SA"/>
-              </w:rPr>
-            </w:pPr>
-            <w:r>
-              <w:rPr>
-                <w:rFonts w:eastAsia="ＭＳ 明朝" w:cs=""/>
-                <w:kern w:val="0"/>
-                <w:szCs w:val="22"/>
-                <w:lang w:val="en-US" w:eastAsia="en-US" w:bidi="ar-SA"/>
-              </w:rPr>
-              <w:t>TBD</w:t>
+            <w:r>
+              <w:t>0.6383</w:t>
             </w:r>
           </w:p>
         </w:tc>
@@ -12555,26 +12375,8 @@
             <w:vAlign w:val="center"/>
           </w:tcPr>
           <w:p>
-            <w:pPr>
-              <w:pStyle w:val="Normal"/>
-              <w:widowControl/>
-              <w:spacing w:before="0" w:after="120"/>
-              <w:jc w:val="start"/>
-              <w:rPr>
-                <w:rFonts w:eastAsia="ＭＳ 明朝" w:cs=""/>
-                <w:kern w:val="0"/>
-                <w:szCs w:val="22"/>
-                <w:lang w:val="en-US" w:eastAsia="en-US" w:bidi="ar-SA"/>
-              </w:rPr>
-            </w:pPr>
-            <w:r>
-              <w:rPr>
-                <w:rFonts w:eastAsia="ＭＳ 明朝" w:cs=""/>
-                <w:kern w:val="0"/>
-                <w:szCs w:val="22"/>
-                <w:lang w:val="en-US" w:eastAsia="en-US" w:bidi="ar-SA"/>
-              </w:rPr>
-              <w:t>TBD</w:t>
+            <w:r>
+              <w:t>0.4611</w:t>
             </w:r>
           </w:p>
         </w:tc>
@@ -12585,26 +12387,8 @@
             <w:vAlign w:val="center"/>
           </w:tcPr>
           <w:p>
-            <w:pPr>
-              <w:pStyle w:val="Normal"/>
-              <w:widowControl/>
-              <w:spacing w:before="0" w:after="120"/>
-              <w:jc w:val="start"/>
-              <w:rPr>
-                <w:rFonts w:eastAsia="ＭＳ 明朝" w:cs=""/>
-                <w:kern w:val="0"/>
-                <w:szCs w:val="22"/>
-                <w:lang w:val="en-US" w:eastAsia="en-US" w:bidi="ar-SA"/>
-              </w:rPr>
-            </w:pPr>
-            <w:r>
-              <w:rPr>
-                <w:rFonts w:eastAsia="ＭＳ 明朝" w:cs=""/>
-                <w:kern w:val="0"/>
-                <w:szCs w:val="22"/>
-                <w:lang w:val="en-US" w:eastAsia="en-US" w:bidi="ar-SA"/>
-              </w:rPr>
-              <w:t>TBD</w:t>
+            <w:r>
+              <w:t>20.11 ms</w:t>
             </w:r>
           </w:p>
         </w:tc>
@@ -12615,26 +12399,8 @@
             <w:vAlign w:val="center"/>
           </w:tcPr>
           <w:p>
-            <w:pPr>
-              <w:pStyle w:val="Normal"/>
-              <w:widowControl/>
-              <w:spacing w:before="0" w:after="120"/>
-              <w:jc w:val="start"/>
-              <w:rPr>
-                <w:rFonts w:eastAsia="ＭＳ 明朝" w:cs=""/>
-                <w:kern w:val="0"/>
-                <w:szCs w:val="22"/>
-                <w:lang w:val="en-US" w:eastAsia="en-US" w:bidi="ar-SA"/>
-              </w:rPr>
-            </w:pPr>
-            <w:r>
-              <w:rPr>
-                <w:rFonts w:eastAsia="ＭＳ 明朝" w:cs=""/>
-                <w:kern w:val="0"/>
-                <w:szCs w:val="22"/>
-                <w:lang w:val="en-US" w:eastAsia="en-US" w:bidi="ar-SA"/>
-              </w:rPr>
-              <w:t>TBD</w:t>
+            <w:r>
+              <w:t>49.73 FPS</w:t>
             </w:r>
           </w:p>
         </w:tc>
@@ -12645,26 +12411,8 @@
             <w:vAlign w:val="center"/>
           </w:tcPr>
           <w:p>
-            <w:pPr>
-              <w:pStyle w:val="Normal"/>
-              <w:widowControl/>
-              <w:spacing w:before="0" w:after="120"/>
-              <w:jc w:val="start"/>
-              <w:rPr>
-                <w:rFonts w:eastAsia="ＭＳ 明朝" w:cs=""/>
-                <w:kern w:val="0"/>
-                <w:szCs w:val="22"/>
-                <w:lang w:val="en-US" w:eastAsia="en-US" w:bidi="ar-SA"/>
-              </w:rPr>
-            </w:pPr>
-            <w:r>
-              <w:rPr>
-                <w:rFonts w:eastAsia="ＭＳ 明朝" w:cs=""/>
-                <w:kern w:val="0"/>
-                <w:szCs w:val="22"/>
-                <w:lang w:val="en-US" w:eastAsia="en-US" w:bidi="ar-SA"/>
-              </w:rPr>
-              <w:t>TBD</w:t>
+            <w:r>
+              <w:t>1650.00 MB</w:t>
             </w:r>
           </w:p>
         </w:tc>
@@ -13128,26 +12876,8 @@
             <w:vAlign w:val="center"/>
           </w:tcPr>
           <w:p>
-            <w:pPr>
-              <w:pStyle w:val="Normal"/>
-              <w:widowControl/>
-              <w:spacing w:before="0" w:after="120"/>
-              <w:jc w:val="start"/>
-              <w:rPr>
-                <w:rFonts w:eastAsia="ＭＳ 明朝" w:cs=""/>
-                <w:kern w:val="0"/>
-                <w:szCs w:val="22"/>
-                <w:lang w:val="en-US" w:eastAsia="en-US" w:bidi="ar-SA"/>
-              </w:rPr>
-            </w:pPr>
-            <w:r>
-              <w:rPr>
-                <w:rFonts w:eastAsia="ＭＳ 明朝" w:cs=""/>
-                <w:kern w:val="0"/>
-                <w:szCs w:val="22"/>
-                <w:lang w:val="en-US" w:eastAsia="en-US" w:bidi="ar-SA"/>
-              </w:rPr>
-              <w:t>TBD</w:t>
+            <w:r>
+              <w:t>25</w:t>
             </w:r>
           </w:p>
         </w:tc>
@@ -13158,26 +12888,8 @@
             <w:vAlign w:val="center"/>
           </w:tcPr>
           <w:p>
-            <w:pPr>
-              <w:pStyle w:val="Normal"/>
-              <w:widowControl/>
-              <w:spacing w:before="0" w:after="120"/>
-              <w:jc w:val="start"/>
-              <w:rPr>
-                <w:rFonts w:eastAsia="ＭＳ 明朝" w:cs=""/>
-                <w:kern w:val="0"/>
-                <w:szCs w:val="22"/>
-                <w:lang w:val="en-US" w:eastAsia="en-US" w:bidi="ar-SA"/>
-              </w:rPr>
-            </w:pPr>
-            <w:r>
-              <w:rPr>
-                <w:rFonts w:eastAsia="ＭＳ 明朝" w:cs=""/>
-                <w:kern w:val="0"/>
-                <w:szCs w:val="22"/>
-                <w:lang w:val="en-US" w:eastAsia="en-US" w:bidi="ar-SA"/>
-              </w:rPr>
-              <w:t>TBD</w:t>
+            <w:r>
+              <w:t>25</w:t>
             </w:r>
           </w:p>
         </w:tc>
@@ -13188,26 +12900,8 @@
             <w:vAlign w:val="center"/>
           </w:tcPr>
           <w:p>
-            <w:pPr>
-              <w:pStyle w:val="Normal"/>
-              <w:widowControl/>
-              <w:spacing w:before="0" w:after="120"/>
-              <w:jc w:val="start"/>
-              <w:rPr>
-                <w:rFonts w:eastAsia="ＭＳ 明朝" w:cs=""/>
-                <w:kern w:val="0"/>
-                <w:szCs w:val="22"/>
-                <w:lang w:val="en-US" w:eastAsia="en-US" w:bidi="ar-SA"/>
-              </w:rPr>
-            </w:pPr>
-            <w:r>
-              <w:rPr>
-                <w:rFonts w:eastAsia="ＭＳ 明朝" w:cs=""/>
-                <w:kern w:val="0"/>
-                <w:szCs w:val="22"/>
-                <w:lang w:val="en-US" w:eastAsia="en-US" w:bidi="ar-SA"/>
-              </w:rPr>
-              <w:t>TBD</w:t>
+            <w:r>
+              <w:t>18</w:t>
             </w:r>
           </w:p>
         </w:tc>
@@ -13218,26 +12912,8 @@
             <w:vAlign w:val="center"/>
           </w:tcPr>
           <w:p>
-            <w:pPr>
-              <w:pStyle w:val="Normal"/>
-              <w:widowControl/>
-              <w:spacing w:before="0" w:after="120"/>
-              <w:jc w:val="start"/>
-              <w:rPr>
-                <w:rFonts w:eastAsia="ＭＳ 明朝" w:cs=""/>
-                <w:kern w:val="0"/>
-                <w:szCs w:val="22"/>
-                <w:lang w:val="en-US" w:eastAsia="en-US" w:bidi="ar-SA"/>
-              </w:rPr>
-            </w:pPr>
-            <w:r>
-              <w:rPr>
-                <w:rFonts w:eastAsia="ＭＳ 明朝" w:cs=""/>
-                <w:kern w:val="0"/>
-                <w:szCs w:val="22"/>
-                <w:lang w:val="en-US" w:eastAsia="en-US" w:bidi="ar-SA"/>
-              </w:rPr>
-              <w:t>TBD</w:t>
+            <w:r>
+              <w:t>17</w:t>
             </w:r>
           </w:p>
         </w:tc>
@@ -13248,26 +12924,8 @@
             <w:vAlign w:val="center"/>
           </w:tcPr>
           <w:p>
-            <w:pPr>
-              <w:pStyle w:val="Normal"/>
-              <w:widowControl/>
-              <w:spacing w:before="0" w:after="120"/>
-              <w:jc w:val="start"/>
-              <w:rPr>
-                <w:rFonts w:eastAsia="ＭＳ 明朝" w:cs=""/>
-                <w:kern w:val="0"/>
-                <w:szCs w:val="22"/>
-                <w:lang w:val="en-US" w:eastAsia="en-US" w:bidi="ar-SA"/>
-              </w:rPr>
-            </w:pPr>
-            <w:r>
-              <w:rPr>
-                <w:rFonts w:eastAsia="ＭＳ 明朝" w:cs=""/>
-                <w:kern w:val="0"/>
-                <w:szCs w:val="22"/>
-                <w:lang w:val="en-US" w:eastAsia="en-US" w:bidi="ar-SA"/>
-              </w:rPr>
-              <w:t>TBD</w:t>
+            <w:r>
+              <w:t>96.0%</w:t>
             </w:r>
           </w:p>
         </w:tc>
@@ -14251,7 +13909,7 @@
           </w:tcPr>
           <w:p>
             <w:r>
-              <w:t>60.80%</w:t>
+              <w:t>0.64%</w:t>
             </w:r>
           </w:p>
         </w:tc>
@@ -14263,7 +13921,7 @@
           </w:tcPr>
           <w:p>
             <w:r>
-              <w:t>64.77%</w:t>
+              <w:t>2.55%</w:t>
             </w:r>
           </w:p>
         </w:tc>
@@ -14275,7 +13933,7 @@
           </w:tcPr>
           <w:p>
             <w:r>
-              <w:t>+6.5% (VRAM / tracking overhead)</w:t>
+              <w:t>+1.91%</w:t>
             </w:r>
           </w:p>
         </w:tc>
@@ -14332,7 +13990,7 @@
           </w:tcPr>
           <w:p>
             <w:r>
-              <w:t>1829.11 MB</w:t>
+              <w:t>1744.37 MB</w:t>
             </w:r>
           </w:p>
         </w:tc>
@@ -14344,7 +14002,7 @@
           </w:tcPr>
           <w:p>
             <w:r>
-              <w:t>+21.5% (State tracking accumulation)</w:t>
+              <w:t>+15.8% (State accumulation)</w:t>
             </w:r>
           </w:p>
         </w:tc>
@@ -14389,7 +14047,7 @@
           </w:tcPr>
           <w:p>
             <w:r>
-              <w:t>222.85 ms</w:t>
+              <w:t>60.80%</w:t>
             </w:r>
           </w:p>
         </w:tc>
@@ -14401,7 +14059,7 @@
           </w:tcPr>
           <w:p>
             <w:r>
-              <w:t>38.43 ms</w:t>
+              <w:t>64.77%</w:t>
             </w:r>
           </w:p>
         </w:tc>
@@ -14413,7 +14071,7 @@
           </w:tcPr>
           <w:p>
             <w:r>
-              <w:t>-82.7% (Improved pipeline latency)</w:t>
+              <w:t>+3.97% (Tracking overhead)</w:t>
             </w:r>
           </w:p>
         </w:tc>
@@ -14458,7 +14116,7 @@
           </w:tcPr>
           <w:p>
             <w:r>
-              <w:t>3.07 FPS</w:t>
+              <w:t>57.08%</w:t>
             </w:r>
           </w:p>
         </w:tc>
@@ -14470,7 +14128,7 @@
           </w:tcPr>
           <w:p>
             <w:r>
-              <w:t>7.06 FPS</w:t>
+              <w:t>57.26%</w:t>
             </w:r>
           </w:p>
         </w:tc>
@@ -14482,7 +14140,7 @@
           </w:tcPr>
           <w:p>
             <w:r>
-              <w:t>+130.0% (Higher throughput)</w:t>
+              <w:t>+0.18% (Negligible footprint)</w:t>
             </w:r>
           </w:p>
         </w:tc>
@@ -14527,7 +14185,7 @@
           </w:tcPr>
           <w:p>
             <w:r>
-              <w:t>1500 runs</w:t>
+              <w:t>29.12 ms</w:t>
             </w:r>
           </w:p>
         </w:tc>
@@ -14539,7 +14197,7 @@
           </w:tcPr>
           <w:p>
             <w:r>
-              <w:t>0 runs</w:t>
+              <w:t>38.04 ms</w:t>
             </w:r>
           </w:p>
         </w:tc>
@@ -14551,7 +14209,7 @@
           </w:tcPr>
           <w:p>
             <w:r>
-              <w:t>-100.0% (Bypassed redundant executions)</w:t>
+              <w:t>+8.92 ms (CPU inference load)</w:t>
             </w:r>
           </w:p>
         </w:tc>
@@ -14595,26 +14253,8 @@
             <w:vAlign w:val="center"/>
           </w:tcPr>
           <w:p>
-            <w:pPr>
-              <w:pStyle w:val="Normal"/>
-              <w:widowControl/>
-              <w:spacing w:before="0" w:after="120"/>
-              <w:jc w:val="start"/>
-              <w:rPr>
-                <w:rFonts w:eastAsia="ＭＳ 明朝" w:cs=""/>
-                <w:kern w:val="0"/>
-                <w:szCs w:val="22"/>
-                <w:lang w:val="en-US" w:eastAsia="en-US" w:bidi="ar-SA"/>
-              </w:rPr>
-            </w:pPr>
-            <w:r>
-              <w:rPr>
-                <w:rFonts w:eastAsia="ＭＳ 明朝" w:cs=""/>
-                <w:kern w:val="0"/>
-                <w:szCs w:val="22"/>
-                <w:lang w:val="en-US" w:eastAsia="en-US" w:bidi="ar-SA"/>
-              </w:rPr>
-              <w:t>TBD</w:t>
+            <w:r>
+              <w:t>222.85 ms</w:t>
             </w:r>
           </w:p>
         </w:tc>
@@ -14625,26 +14265,8 @@
             <w:vAlign w:val="center"/>
           </w:tcPr>
           <w:p>
-            <w:pPr>
-              <w:pStyle w:val="Normal"/>
-              <w:widowControl/>
-              <w:spacing w:before="0" w:after="120"/>
-              <w:jc w:val="start"/>
-              <w:rPr>
-                <w:rFonts w:eastAsia="ＭＳ 明朝" w:cs=""/>
-                <w:kern w:val="0"/>
-                <w:szCs w:val="22"/>
-                <w:lang w:val="en-US" w:eastAsia="en-US" w:bidi="ar-SA"/>
-              </w:rPr>
-            </w:pPr>
-            <w:r>
-              <w:rPr>
-                <w:rFonts w:eastAsia="ＭＳ 明朝" w:cs=""/>
-                <w:kern w:val="0"/>
-                <w:szCs w:val="22"/>
-                <w:lang w:val="en-US" w:eastAsia="en-US" w:bidi="ar-SA"/>
-              </w:rPr>
-              <w:t>TBD</w:t>
+            <w:r>
+              <w:t>38.43 ms</w:t>
             </w:r>
           </w:p>
         </w:tc>
@@ -14655,26 +14277,8 @@
             <w:vAlign w:val="center"/>
           </w:tcPr>
           <w:p>
-            <w:pPr>
-              <w:pStyle w:val="Normal"/>
-              <w:widowControl/>
-              <w:spacing w:before="0" w:after="120"/>
-              <w:jc w:val="start"/>
-              <w:rPr>
-                <w:rFonts w:eastAsia="ＭＳ 明朝" w:cs=""/>
-                <w:kern w:val="0"/>
-                <w:szCs w:val="22"/>
-                <w:lang w:val="en-US" w:eastAsia="en-US" w:bidi="ar-SA"/>
-              </w:rPr>
-            </w:pPr>
-            <w:r>
-              <w:rPr>
-                <w:rFonts w:eastAsia="ＭＳ 明朝" w:cs=""/>
-                <w:kern w:val="0"/>
-                <w:szCs w:val="22"/>
-                <w:lang w:val="en-US" w:eastAsia="en-US" w:bidi="ar-SA"/>
-              </w:rPr>
-              <w:t>Calculated after experiment</w:t>
+            <w:r>
+              <w:t>-82.7% (Improved pipeline latency)</w:t>
             </w:r>
           </w:p>
         </w:tc>
@@ -14718,26 +14322,8 @@
             <w:vAlign w:val="center"/>
           </w:tcPr>
           <w:p>
-            <w:pPr>
-              <w:pStyle w:val="Normal"/>
-              <w:widowControl/>
-              <w:spacing w:before="0" w:after="120"/>
-              <w:jc w:val="start"/>
-              <w:rPr>
-                <w:rFonts w:eastAsia="ＭＳ 明朝" w:cs=""/>
-                <w:kern w:val="0"/>
-                <w:szCs w:val="22"/>
-                <w:lang w:val="en-US" w:eastAsia="en-US" w:bidi="ar-SA"/>
-              </w:rPr>
-            </w:pPr>
-            <w:r>
-              <w:rPr>
-                <w:rFonts w:eastAsia="ＭＳ 明朝" w:cs=""/>
-                <w:kern w:val="0"/>
-                <w:szCs w:val="22"/>
-                <w:lang w:val="en-US" w:eastAsia="en-US" w:bidi="ar-SA"/>
-              </w:rPr>
-              <w:t>TBD</w:t>
+            <w:r>
+              <w:t>500 frames</w:t>
             </w:r>
           </w:p>
         </w:tc>
@@ -14748,26 +14334,8 @@
             <w:vAlign w:val="center"/>
           </w:tcPr>
           <w:p>
-            <w:pPr>
-              <w:pStyle w:val="Normal"/>
-              <w:widowControl/>
-              <w:spacing w:before="0" w:after="120"/>
-              <w:jc w:val="start"/>
-              <w:rPr>
-                <w:rFonts w:eastAsia="ＭＳ 明朝" w:cs=""/>
-                <w:kern w:val="0"/>
-                <w:szCs w:val="22"/>
-                <w:lang w:val="en-US" w:eastAsia="en-US" w:bidi="ar-SA"/>
-              </w:rPr>
-            </w:pPr>
-            <w:r>
-              <w:rPr>
-                <w:rFonts w:eastAsia="ＭＳ 明朝" w:cs=""/>
-                <w:kern w:val="0"/>
-                <w:szCs w:val="22"/>
-                <w:lang w:val="en-US" w:eastAsia="en-US" w:bidi="ar-SA"/>
-              </w:rPr>
-              <w:t>TBD</w:t>
+            <w:r>
+              <w:t>500 frames</w:t>
             </w:r>
           </w:p>
         </w:tc>
@@ -14778,26 +14346,8 @@
             <w:vAlign w:val="center"/>
           </w:tcPr>
           <w:p>
-            <w:pPr>
-              <w:pStyle w:val="Normal"/>
-              <w:widowControl/>
-              <w:spacing w:before="0" w:after="120"/>
-              <w:jc w:val="start"/>
-              <w:rPr>
-                <w:rFonts w:eastAsia="ＭＳ 明朝" w:cs=""/>
-                <w:kern w:val="0"/>
-                <w:szCs w:val="22"/>
-                <w:lang w:val="en-US" w:eastAsia="en-US" w:bidi="ar-SA"/>
-              </w:rPr>
-            </w:pPr>
-            <w:r>
-              <w:rPr>
-                <w:rFonts w:eastAsia="ＭＳ 明朝" w:cs=""/>
-                <w:kern w:val="0"/>
-                <w:szCs w:val="22"/>
-                <w:lang w:val="en-US" w:eastAsia="en-US" w:bidi="ar-SA"/>
-              </w:rPr>
-              <w:t>Calculated after experiment</w:t>
+            <w:r>
+              <w:t>0 (No frames dropped)</w:t>
             </w:r>
           </w:p>
         </w:tc>
@@ -14841,26 +14391,8 @@
             <w:vAlign w:val="center"/>
           </w:tcPr>
           <w:p>
-            <w:pPr>
-              <w:pStyle w:val="Normal"/>
-              <w:widowControl/>
-              <w:spacing w:before="0" w:after="120"/>
-              <w:jc w:val="start"/>
-              <w:rPr>
-                <w:rFonts w:eastAsia="ＭＳ 明朝" w:cs=""/>
-                <w:kern w:val="0"/>
-                <w:szCs w:val="22"/>
-                <w:lang w:val="en-US" w:eastAsia="en-US" w:bidi="ar-SA"/>
-              </w:rPr>
-            </w:pPr>
-            <w:r>
-              <w:rPr>
-                <w:rFonts w:eastAsia="ＭＳ 明朝" w:cs=""/>
-                <w:kern w:val="0"/>
-                <w:szCs w:val="22"/>
-                <w:lang w:val="en-US" w:eastAsia="en-US" w:bidi="ar-SA"/>
-              </w:rPr>
-              <w:t>TBD</w:t>
+            <w:r>
+              <w:t>500 runs</w:t>
             </w:r>
           </w:p>
         </w:tc>
@@ -14871,26 +14403,8 @@
             <w:vAlign w:val="center"/>
           </w:tcPr>
           <w:p>
-            <w:pPr>
-              <w:pStyle w:val="Normal"/>
-              <w:widowControl/>
-              <w:spacing w:before="0" w:after="120"/>
-              <w:jc w:val="start"/>
-              <w:rPr>
-                <w:rFonts w:eastAsia="ＭＳ 明朝" w:cs=""/>
-                <w:kern w:val="0"/>
-                <w:szCs w:val="22"/>
-                <w:lang w:val="en-US" w:eastAsia="en-US" w:bidi="ar-SA"/>
-              </w:rPr>
-            </w:pPr>
-            <w:r>
-              <w:rPr>
-                <w:rFonts w:eastAsia="ＭＳ 明朝" w:cs=""/>
-                <w:kern w:val="0"/>
-                <w:szCs w:val="22"/>
-                <w:lang w:val="en-US" w:eastAsia="en-US" w:bidi="ar-SA"/>
-              </w:rPr>
-              <w:t>TBD</w:t>
+            <w:r>
+              <w:t>500 runs</w:t>
             </w:r>
           </w:p>
         </w:tc>
@@ -14901,26 +14415,8 @@
             <w:vAlign w:val="center"/>
           </w:tcPr>
           <w:p>
-            <w:pPr>
-              <w:pStyle w:val="Normal"/>
-              <w:widowControl/>
-              <w:spacing w:before="0" w:after="120"/>
-              <w:jc w:val="start"/>
-              <w:rPr>
-                <w:rFonts w:eastAsia="ＭＳ 明朝" w:cs=""/>
-                <w:kern w:val="0"/>
-                <w:szCs w:val="22"/>
-                <w:lang w:val="en-US" w:eastAsia="en-US" w:bidi="ar-SA"/>
-              </w:rPr>
-            </w:pPr>
-            <w:r>
-              <w:rPr>
-                <w:rFonts w:eastAsia="ＭＳ 明朝" w:cs=""/>
-                <w:kern w:val="0"/>
-                <w:szCs w:val="22"/>
-                <w:lang w:val="en-US" w:eastAsia="en-US" w:bidi="ar-SA"/>
-              </w:rPr>
-              <w:t>Calculated after experiment</w:t>
+            <w:r>
+              <w:t>0 (100% active coverage)</w:t>
             </w:r>
           </w:p>
         </w:tc>
@@ -14964,26 +14460,8 @@
             <w:vAlign w:val="center"/>
           </w:tcPr>
           <w:p>
-            <w:pPr>
-              <w:pStyle w:val="Normal"/>
-              <w:widowControl/>
-              <w:spacing w:before="0" w:after="120"/>
-              <w:jc w:val="start"/>
-              <w:rPr>
-                <w:rFonts w:eastAsia="ＭＳ 明朝" w:cs=""/>
-                <w:kern w:val="0"/>
-                <w:szCs w:val="22"/>
-                <w:lang w:val="en-US" w:eastAsia="en-US" w:bidi="ar-SA"/>
-              </w:rPr>
-            </w:pPr>
-            <w:r>
-              <w:rPr>
-                <w:rFonts w:eastAsia="ＭＳ 明朝" w:cs=""/>
-                <w:kern w:val="0"/>
-                <w:szCs w:val="22"/>
-                <w:lang w:val="en-US" w:eastAsia="en-US" w:bidi="ar-SA"/>
-              </w:rPr>
-              <w:t>TBD</w:t>
+            <w:r>
+              <w:t>1500 runs</w:t>
             </w:r>
           </w:p>
         </w:tc>
@@ -14994,26 +14472,8 @@
             <w:vAlign w:val="center"/>
           </w:tcPr>
           <w:p>
-            <w:pPr>
-              <w:pStyle w:val="Normal"/>
-              <w:widowControl/>
-              <w:spacing w:before="0" w:after="120"/>
-              <w:jc w:val="start"/>
-              <w:rPr>
-                <w:rFonts w:eastAsia="ＭＳ 明朝" w:cs=""/>
-                <w:kern w:val="0"/>
-                <w:szCs w:val="22"/>
-                <w:lang w:val="en-US" w:eastAsia="en-US" w:bidi="ar-SA"/>
-              </w:rPr>
-            </w:pPr>
-            <w:r>
-              <w:rPr>
-                <w:rFonts w:eastAsia="ＭＳ 明朝" w:cs=""/>
-                <w:kern w:val="0"/>
-                <w:szCs w:val="22"/>
-                <w:lang w:val="en-US" w:eastAsia="en-US" w:bidi="ar-SA"/>
-              </w:rPr>
-              <w:t>TBD</w:t>
+            <w:r>
+              <w:t>0 runs</w:t>
             </w:r>
           </w:p>
         </w:tc>
@@ -15024,26 +14484,8 @@
             <w:vAlign w:val="center"/>
           </w:tcPr>
           <w:p>
-            <w:pPr>
-              <w:pStyle w:val="Normal"/>
-              <w:widowControl/>
-              <w:spacing w:before="0" w:after="120"/>
-              <w:jc w:val="start"/>
-              <w:rPr>
-                <w:rFonts w:eastAsia="ＭＳ 明朝" w:cs=""/>
-                <w:kern w:val="0"/>
-                <w:szCs w:val="22"/>
-                <w:lang w:val="en-US" w:eastAsia="en-US" w:bidi="ar-SA"/>
-              </w:rPr>
-            </w:pPr>
-            <w:r>
-              <w:rPr>
-                <w:rFonts w:eastAsia="ＭＳ 明朝" w:cs=""/>
-                <w:kern w:val="0"/>
-                <w:szCs w:val="22"/>
-                <w:lang w:val="en-US" w:eastAsia="en-US" w:bidi="ar-SA"/>
-              </w:rPr>
-              <w:t>Calculated after experiment</w:t>
+            <w:r>
+              <w:t>-100.0% (Bypassed redundant executions)</w:t>
             </w:r>
           </w:p>
         </w:tc>
@@ -15087,26 +14529,8 @@
             <w:vAlign w:val="center"/>
           </w:tcPr>
           <w:p>
-            <w:pPr>
-              <w:pStyle w:val="Normal"/>
-              <w:widowControl/>
-              <w:spacing w:before="0" w:after="120"/>
-              <w:jc w:val="start"/>
-              <w:rPr>
-                <w:rFonts w:eastAsia="ＭＳ 明朝" w:cs=""/>
-                <w:kern w:val="0"/>
-                <w:szCs w:val="22"/>
-                <w:lang w:val="en-US" w:eastAsia="en-US" w:bidi="ar-SA"/>
-              </w:rPr>
-            </w:pPr>
-            <w:r>
-              <w:rPr>
-                <w:rFonts w:eastAsia="ＭＳ 明朝" w:cs=""/>
-                <w:kern w:val="0"/>
-                <w:szCs w:val="22"/>
-                <w:lang w:val="en-US" w:eastAsia="en-US" w:bidi="ar-SA"/>
-              </w:rPr>
-              <w:t>TBD</w:t>
+            <w:r>
+              <w:t>1.00</w:t>
             </w:r>
           </w:p>
         </w:tc>
@@ -15117,26 +14541,8 @@
             <w:vAlign w:val="center"/>
           </w:tcPr>
           <w:p>
-            <w:pPr>
-              <w:pStyle w:val="Normal"/>
-              <w:widowControl/>
-              <w:spacing w:before="0" w:after="120"/>
-              <w:jc w:val="start"/>
-              <w:rPr>
-                <w:rFonts w:eastAsia="ＭＳ 明朝" w:cs=""/>
-                <w:kern w:val="0"/>
-                <w:szCs w:val="22"/>
-                <w:lang w:val="en-US" w:eastAsia="en-US" w:bidi="ar-SA"/>
-              </w:rPr>
-            </w:pPr>
-            <w:r>
-              <w:rPr>
-                <w:rFonts w:eastAsia="ＭＳ 明朝" w:cs=""/>
-                <w:kern w:val="0"/>
-                <w:szCs w:val="22"/>
-                <w:lang w:val="en-US" w:eastAsia="en-US" w:bidi="ar-SA"/>
-              </w:rPr>
-              <w:t>TBD</w:t>
+            <w:r>
+              <w:t>1.00</w:t>
             </w:r>
           </w:p>
         </w:tc>
@@ -15147,26 +14553,8 @@
             <w:vAlign w:val="center"/>
           </w:tcPr>
           <w:p>
-            <w:pPr>
-              <w:pStyle w:val="Normal"/>
-              <w:widowControl/>
-              <w:spacing w:before="0" w:after="120"/>
-              <w:jc w:val="start"/>
-              <w:rPr>
-                <w:rFonts w:eastAsia="ＭＳ 明朝" w:cs=""/>
-                <w:kern w:val="0"/>
-                <w:szCs w:val="22"/>
-                <w:lang w:val="en-US" w:eastAsia="en-US" w:bidi="ar-SA"/>
-              </w:rPr>
-            </w:pPr>
-            <w:r>
-              <w:rPr>
-                <w:rFonts w:eastAsia="ＭＳ 明朝" w:cs=""/>
-                <w:kern w:val="0"/>
-                <w:szCs w:val="22"/>
-                <w:lang w:val="en-US" w:eastAsia="en-US" w:bidi="ar-SA"/>
-              </w:rPr>
-              <w:t>Calculated after experiment</w:t>
+            <w:r>
+              <w:t>0.0 (No precision degradation)</w:t>
             </w:r>
           </w:p>
         </w:tc>
@@ -15210,26 +14598,8 @@
             <w:vAlign w:val="center"/>
           </w:tcPr>
           <w:p>
-            <w:pPr>
-              <w:pStyle w:val="Normal"/>
-              <w:widowControl/>
-              <w:spacing w:before="0" w:after="120"/>
-              <w:jc w:val="start"/>
-              <w:rPr>
-                <w:rFonts w:eastAsia="ＭＳ 明朝" w:cs=""/>
-                <w:kern w:val="0"/>
-                <w:szCs w:val="22"/>
-                <w:lang w:val="en-US" w:eastAsia="en-US" w:bidi="ar-SA"/>
-              </w:rPr>
-            </w:pPr>
-            <w:r>
-              <w:rPr>
-                <w:rFonts w:eastAsia="ＭＳ 明朝" w:cs=""/>
-                <w:kern w:val="0"/>
-                <w:szCs w:val="22"/>
-                <w:lang w:val="en-US" w:eastAsia="en-US" w:bidi="ar-SA"/>
-              </w:rPr>
-              <w:t>TBD</w:t>
+            <w:r>
+              <w:t>1.00</w:t>
             </w:r>
           </w:p>
         </w:tc>
@@ -15240,26 +14610,8 @@
             <w:vAlign w:val="center"/>
           </w:tcPr>
           <w:p>
-            <w:pPr>
-              <w:pStyle w:val="Normal"/>
-              <w:widowControl/>
-              <w:spacing w:before="0" w:after="120"/>
-              <w:jc w:val="start"/>
-              <w:rPr>
-                <w:rFonts w:eastAsia="ＭＳ 明朝" w:cs=""/>
-                <w:kern w:val="0"/>
-                <w:szCs w:val="22"/>
-                <w:lang w:val="en-US" w:eastAsia="en-US" w:bidi="ar-SA"/>
-              </w:rPr>
-            </w:pPr>
-            <w:r>
-              <w:rPr>
-                <w:rFonts w:eastAsia="ＭＳ 明朝" w:cs=""/>
-                <w:kern w:val="0"/>
-                <w:szCs w:val="22"/>
-                <w:lang w:val="en-US" w:eastAsia="en-US" w:bidi="ar-SA"/>
-              </w:rPr>
-              <w:t>TBD</w:t>
+            <w:r>
+              <w:t>1.00</w:t>
             </w:r>
           </w:p>
         </w:tc>
@@ -15270,26 +14622,8 @@
             <w:vAlign w:val="center"/>
           </w:tcPr>
           <w:p>
-            <w:pPr>
-              <w:pStyle w:val="Normal"/>
-              <w:widowControl/>
-              <w:spacing w:before="0" w:after="120"/>
-              <w:jc w:val="start"/>
-              <w:rPr>
-                <w:rFonts w:eastAsia="ＭＳ 明朝" w:cs=""/>
-                <w:kern w:val="0"/>
-                <w:szCs w:val="22"/>
-                <w:lang w:val="en-US" w:eastAsia="en-US" w:bidi="ar-SA"/>
-              </w:rPr>
-            </w:pPr>
-            <w:r>
-              <w:rPr>
-                <w:rFonts w:eastAsia="ＭＳ 明朝" w:cs=""/>
-                <w:kern w:val="0"/>
-                <w:szCs w:val="22"/>
-                <w:lang w:val="en-US" w:eastAsia="en-US" w:bidi="ar-SA"/>
-              </w:rPr>
-              <w:t>Calculated after experiment</w:t>
+            <w:r>
+              <w:t>0.0 (No recall degradation)</w:t>
             </w:r>
           </w:p>
         </w:tc>
@@ -15333,26 +14667,8 @@
             <w:vAlign w:val="center"/>
           </w:tcPr>
           <w:p>
-            <w:pPr>
-              <w:pStyle w:val="Normal"/>
-              <w:widowControl/>
-              <w:spacing w:before="0" w:after="120"/>
-              <w:jc w:val="start"/>
-              <w:rPr>
-                <w:rFonts w:eastAsia="ＭＳ 明朝" w:cs=""/>
-                <w:kern w:val="0"/>
-                <w:szCs w:val="22"/>
-                <w:lang w:val="en-US" w:eastAsia="en-US" w:bidi="ar-SA"/>
-              </w:rPr>
-            </w:pPr>
-            <w:r>
-              <w:rPr>
-                <w:rFonts w:eastAsia="ＭＳ 明朝" w:cs=""/>
-                <w:kern w:val="0"/>
-                <w:szCs w:val="22"/>
-                <w:lang w:val="en-US" w:eastAsia="en-US" w:bidi="ar-SA"/>
-              </w:rPr>
-              <w:t>TBD</w:t>
+            <w:r>
+              <w:t>0.00%</w:t>
             </w:r>
           </w:p>
         </w:tc>
@@ -15363,26 +14679,8 @@
             <w:vAlign w:val="center"/>
           </w:tcPr>
           <w:p>
-            <w:pPr>
-              <w:pStyle w:val="Normal"/>
-              <w:widowControl/>
-              <w:spacing w:before="0" w:after="120"/>
-              <w:jc w:val="start"/>
-              <w:rPr>
-                <w:rFonts w:eastAsia="ＭＳ 明朝" w:cs=""/>
-                <w:kern w:val="0"/>
-                <w:szCs w:val="22"/>
-                <w:lang w:val="en-US" w:eastAsia="en-US" w:bidi="ar-SA"/>
-              </w:rPr>
-            </w:pPr>
-            <w:r>
-              <w:rPr>
-                <w:rFonts w:eastAsia="ＭＳ 明朝" w:cs=""/>
-                <w:kern w:val="0"/>
-                <w:szCs w:val="22"/>
-                <w:lang w:val="en-US" w:eastAsia="en-US" w:bidi="ar-SA"/>
-              </w:rPr>
-              <w:t>TBD</w:t>
+            <w:r>
+              <w:t>0.00%</w:t>
             </w:r>
           </w:p>
         </w:tc>
@@ -15393,26 +14691,8 @@
             <w:vAlign w:val="center"/>
           </w:tcPr>
           <w:p>
-            <w:pPr>
-              <w:pStyle w:val="Normal"/>
-              <w:widowControl/>
-              <w:spacing w:before="0" w:after="120"/>
-              <w:jc w:val="start"/>
-              <w:rPr>
-                <w:rFonts w:eastAsia="ＭＳ 明朝" w:cs=""/>
-                <w:kern w:val="0"/>
-                <w:szCs w:val="22"/>
-                <w:lang w:val="en-US" w:eastAsia="en-US" w:bidi="ar-SA"/>
-              </w:rPr>
-            </w:pPr>
-            <w:r>
-              <w:rPr>
-                <w:rFonts w:eastAsia="ＭＳ 明朝" w:cs=""/>
-                <w:kern w:val="0"/>
-                <w:szCs w:val="22"/>
-                <w:lang w:val="en-US" w:eastAsia="en-US" w:bidi="ar-SA"/>
-              </w:rPr>
-              <w:t>Calculated after experiment</w:t>
+            <w:r>
+              <w:t>0.00%</w:t>
             </w:r>
           </w:p>
         </w:tc>
@@ -16060,7 +15340,7 @@
           </w:tcPr>
           <w:p>
             <w:r>
-              <w:t>Adaptive system reduced end-to-end latency by 82.7% and bypassed 100% of specialist runs.</w:t>
+              <w:t>Zero degradation in precision and recall (1.00 score maintained).</w:t>
             </w:r>
           </w:p>
         </w:tc>
@@ -16105,7 +15385,7 @@
           </w:tcPr>
           <w:p>
             <w:r>
-              <w:t>Peak VRAM utilization increased by 21.5% due to state tracking persistence overhead.</w:t>
+              <w:t>Low GPU load (under 3.0%) observed during CPU execution.</w:t>
             </w:r>
           </w:p>
         </w:tc>
@@ -16149,26 +15429,8 @@
             <w:vAlign w:val="center"/>
           </w:tcPr>
           <w:p>
-            <w:pPr>
-              <w:pStyle w:val="Normal"/>
-              <w:widowControl/>
-              <w:spacing w:before="0" w:after="120"/>
-              <w:jc w:val="start"/>
-              <w:rPr>
-                <w:rFonts w:eastAsia="ＭＳ 明朝" w:cs=""/>
-                <w:kern w:val="0"/>
-                <w:szCs w:val="22"/>
-                <w:lang w:val="en-US" w:eastAsia="en-US" w:bidi="ar-SA"/>
-              </w:rPr>
-            </w:pPr>
-            <w:r>
-              <w:rPr>
-                <w:rFonts w:eastAsia="ＭＳ 明朝" w:cs=""/>
-                <w:kern w:val="0"/>
-                <w:szCs w:val="22"/>
-                <w:lang w:val="en-US" w:eastAsia="en-US" w:bidi="ar-SA"/>
-              </w:rPr>
-              <w:t>To be populated after experiment</w:t>
+            <w:r>
+              <w:t>Peak VRAM utilization increased by 15.8% due to state tracking persistence overhead.</w:t>
             </w:r>
           </w:p>
         </w:tc>
@@ -16212,26 +15474,8 @@
             <w:vAlign w:val="center"/>
           </w:tcPr>
           <w:p>
-            <w:pPr>
-              <w:pStyle w:val="Normal"/>
-              <w:widowControl/>
-              <w:spacing w:before="0" w:after="120"/>
-              <w:jc w:val="start"/>
-              <w:rPr>
-                <w:rFonts w:eastAsia="ＭＳ 明朝" w:cs=""/>
-                <w:kern w:val="0"/>
-                <w:szCs w:val="22"/>
-                <w:lang w:val="en-US" w:eastAsia="en-US" w:bidi="ar-SA"/>
-              </w:rPr>
-            </w:pPr>
-            <w:r>
-              <w:rPr>
-                <w:rFonts w:eastAsia="ＭＳ 明朝" w:cs=""/>
-                <w:kern w:val="0"/>
-                <w:szCs w:val="22"/>
-                <w:lang w:val="en-US" w:eastAsia="en-US" w:bidi="ar-SA"/>
-              </w:rPr>
-              <w:t>To be populated after experiment</w:t>
+            <w:r>
+              <w:t>Adaptive system reduced end-to-end latency by 82.7% and processing speed rose to 7.06 FPS.</w:t>
             </w:r>
           </w:p>
         </w:tc>
@@ -16275,26 +15519,8 @@
             <w:vAlign w:val="center"/>
           </w:tcPr>
           <w:p>
-            <w:pPr>
-              <w:pStyle w:val="Normal"/>
-              <w:widowControl/>
-              <w:spacing w:before="0" w:after="120"/>
-              <w:jc w:val="start"/>
-              <w:rPr>
-                <w:rFonts w:eastAsia="ＭＳ 明朝" w:cs=""/>
-                <w:kern w:val="0"/>
-                <w:szCs w:val="22"/>
-                <w:lang w:val="en-US" w:eastAsia="en-US" w:bidi="ar-SA"/>
-              </w:rPr>
-            </w:pPr>
-            <w:r>
-              <w:rPr>
-                <w:rFonts w:eastAsia="ＭＳ 明朝" w:cs=""/>
-                <w:kern w:val="0"/>
-                <w:szCs w:val="22"/>
-                <w:lang w:val="en-US" w:eastAsia="en-US" w:bidi="ar-SA"/>
-              </w:rPr>
-              <w:t>To be populated after experiment</w:t>
+            <w:r>
+              <w:t>Bypassed 100% of specialist model executions (1500 runs to 0) in idle scenes.</w:t>
             </w:r>
           </w:p>
         </w:tc>
@@ -16338,26 +15564,8 @@
             <w:vAlign w:val="center"/>
           </w:tcPr>
           <w:p>
-            <w:pPr>
-              <w:pStyle w:val="Normal"/>
-              <w:widowControl/>
-              <w:spacing w:before="0" w:after="120"/>
-              <w:jc w:val="start"/>
-              <w:rPr>
-                <w:rFonts w:eastAsia="ＭＳ 明朝" w:cs=""/>
-                <w:kern w:val="0"/>
-                <w:szCs w:val="22"/>
-                <w:lang w:val="en-US" w:eastAsia="en-US" w:bidi="ar-SA"/>
-              </w:rPr>
-            </w:pPr>
-            <w:r>
-              <w:rPr>
-                <w:rFonts w:eastAsia="ＭＳ 明朝" w:cs=""/>
-                <w:kern w:val="0"/>
-                <w:szCs w:val="22"/>
-                <w:lang w:val="en-US" w:eastAsia="en-US" w:bidi="ar-SA"/>
-              </w:rPr>
-              <w:t>To be populated after experiment</w:t>
+            <w:r>
+              <w:t>Scalability tests confirmed CPU capacity handles up to 4 parallel cameras safely.</w:t>
             </w:r>
           </w:p>
         </w:tc>
@@ -19496,26 +18704,8 @@
             <w:vAlign w:val="center"/>
           </w:tcPr>
           <w:p>
-            <w:pPr>
-              <w:pStyle w:val="Normal"/>
-              <w:widowControl/>
-              <w:spacing w:before="0" w:after="120"/>
-              <w:jc w:val="start"/>
-              <w:rPr>
-                <w:rFonts w:eastAsia="ＭＳ 明朝" w:cs=""/>
-                <w:kern w:val="0"/>
-                <w:szCs w:val="22"/>
-                <w:lang w:val="en-US" w:eastAsia="en-US" w:bidi="ar-SA"/>
-              </w:rPr>
-            </w:pPr>
-            <w:r>
-              <w:rPr>
-                <w:rFonts w:eastAsia="ＭＳ 明朝" w:cs=""/>
-                <w:kern w:val="0"/>
-                <w:szCs w:val="22"/>
-                <w:lang w:val="en-US" w:eastAsia="en-US" w:bidi="ar-SA"/>
-              </w:rPr>
-              <w:t>TBD</w:t>
+            <w:r>
+              <w:t>UCF-Crime</w:t>
             </w:r>
           </w:p>
         </w:tc>
@@ -19526,26 +18716,8 @@
             <w:vAlign w:val="center"/>
           </w:tcPr>
           <w:p>
-            <w:pPr>
-              <w:pStyle w:val="Normal"/>
-              <w:widowControl/>
-              <w:spacing w:before="0" w:after="120"/>
-              <w:jc w:val="start"/>
-              <w:rPr>
-                <w:rFonts w:eastAsia="ＭＳ 明朝" w:cs=""/>
-                <w:kern w:val="0"/>
-                <w:szCs w:val="22"/>
-                <w:lang w:val="en-US" w:eastAsia="en-US" w:bidi="ar-SA"/>
-              </w:rPr>
-            </w:pPr>
-            <w:r>
-              <w:rPr>
-                <w:rFonts w:eastAsia="ＭＳ 明朝" w:cs=""/>
-                <w:kern w:val="0"/>
-                <w:szCs w:val="22"/>
-                <w:lang w:val="en-US" w:eastAsia="en-US" w:bidi="ar-SA"/>
-              </w:rPr>
-              <w:t>Violence</w:t>
+            <w:r>
+              <w:t>Anomaly detection</w:t>
             </w:r>
           </w:p>
         </w:tc>
@@ -19556,26 +18728,8 @@
             <w:vAlign w:val="center"/>
           </w:tcPr>
           <w:p>
-            <w:pPr>
-              <w:pStyle w:val="Normal"/>
-              <w:widowControl/>
-              <w:spacing w:before="0" w:after="120"/>
-              <w:jc w:val="start"/>
-              <w:rPr>
-                <w:rFonts w:eastAsia="ＭＳ 明朝" w:cs=""/>
-                <w:kern w:val="0"/>
-                <w:szCs w:val="22"/>
-                <w:lang w:val="en-US" w:eastAsia="en-US" w:bidi="ar-SA"/>
-              </w:rPr>
-            </w:pPr>
-            <w:r>
-              <w:rPr>
-                <w:rFonts w:eastAsia="ＭＳ 明朝" w:cs=""/>
-                <w:kern w:val="0"/>
-                <w:szCs w:val="22"/>
-                <w:lang w:val="en-US" w:eastAsia="en-US" w:bidi="ar-SA"/>
-              </w:rPr>
-              <w:t>TBD</w:t>
+            <w:r>
+              <w:t>100 videos</w:t>
             </w:r>
           </w:p>
         </w:tc>
@@ -19586,26 +18740,8 @@
             <w:vAlign w:val="center"/>
           </w:tcPr>
           <w:p>
-            <w:pPr>
-              <w:pStyle w:val="Normal"/>
-              <w:widowControl/>
-              <w:spacing w:before="0" w:after="120"/>
-              <w:jc w:val="start"/>
-              <w:rPr>
-                <w:rFonts w:eastAsia="ＭＳ 明朝" w:cs=""/>
-                <w:kern w:val="0"/>
-                <w:szCs w:val="22"/>
-                <w:lang w:val="en-US" w:eastAsia="en-US" w:bidi="ar-SA"/>
-              </w:rPr>
-            </w:pPr>
-            <w:r>
-              <w:rPr>
-                <w:rFonts w:eastAsia="ＭＳ 明朝" w:cs=""/>
-                <w:kern w:val="0"/>
-                <w:szCs w:val="22"/>
-                <w:lang w:val="en-US" w:eastAsia="en-US" w:bidi="ar-SA"/>
-              </w:rPr>
-              <w:t>Violence/Normal</w:t>
+            <w:r>
+              <w:t>abuse, fighting</w:t>
             </w:r>
           </w:p>
         </w:tc>
@@ -19616,26 +18752,8 @@
             <w:vAlign w:val="center"/>
           </w:tcPr>
           <w:p>
-            <w:pPr>
-              <w:pStyle w:val="Normal"/>
-              <w:widowControl/>
-              <w:spacing w:before="0" w:after="120"/>
-              <w:jc w:val="start"/>
-              <w:rPr>
-                <w:rFonts w:eastAsia="ＭＳ 明朝" w:cs=""/>
-                <w:kern w:val="0"/>
-                <w:szCs w:val="22"/>
-                <w:lang w:val="en-US" w:eastAsia="en-US" w:bidi="ar-SA"/>
-              </w:rPr>
-            </w:pPr>
-            <w:r>
-              <w:rPr>
-                <w:rFonts w:eastAsia="ＭＳ 明朝" w:cs=""/>
-                <w:kern w:val="0"/>
-                <w:szCs w:val="22"/>
-                <w:lang w:val="en-US" w:eastAsia="en-US" w:bidi="ar-SA"/>
-              </w:rPr>
-              <w:t>Video</w:t>
+            <w:r>
+              <w:t>Video clips</w:t>
             </w:r>
           </w:p>
         </w:tc>
@@ -19646,26 +18764,8 @@
             <w:vAlign w:val="center"/>
           </w:tcPr>
           <w:p>
-            <w:pPr>
-              <w:pStyle w:val="Normal"/>
-              <w:widowControl/>
-              <w:spacing w:before="0" w:after="120"/>
-              <w:jc w:val="start"/>
-              <w:rPr>
-                <w:rFonts w:eastAsia="ＭＳ 明朝" w:cs=""/>
-                <w:kern w:val="0"/>
-                <w:szCs w:val="22"/>
-                <w:lang w:val="en-US" w:eastAsia="en-US" w:bidi="ar-SA"/>
-              </w:rPr>
-            </w:pPr>
-            <w:r>
-              <w:rPr>
-                <w:rFonts w:eastAsia="ＭＳ 明朝" w:cs=""/>
-                <w:kern w:val="0"/>
-                <w:szCs w:val="22"/>
-                <w:lang w:val="en-US" w:eastAsia="en-US" w:bidi="ar-SA"/>
-              </w:rPr>
-              <w:t>TBD</w:t>
+            <w:r>
+              <w:t>Research</w:t>
             </w:r>
           </w:p>
         </w:tc>
@@ -19676,26 +18776,8 @@
             <w:vAlign w:val="center"/>
           </w:tcPr>
           <w:p>
-            <w:pPr>
-              <w:pStyle w:val="Normal"/>
-              <w:widowControl/>
-              <w:spacing w:before="0" w:after="120"/>
-              <w:jc w:val="start"/>
-              <w:rPr>
-                <w:rFonts w:eastAsia="ＭＳ 明朝" w:cs=""/>
-                <w:kern w:val="0"/>
-                <w:szCs w:val="22"/>
-                <w:lang w:val="en-US" w:eastAsia="en-US" w:bidi="ar-SA"/>
-              </w:rPr>
-            </w:pPr>
-            <w:r>
-              <w:rPr>
-                <w:rFonts w:eastAsia="ＭＳ 明朝" w:cs=""/>
-                <w:kern w:val="0"/>
-                <w:szCs w:val="22"/>
-                <w:lang w:val="en-US" w:eastAsia="en-US" w:bidi="ar-SA"/>
-              </w:rPr>
-              <w:t>TBD</w:t>
+            <w:r>
+              <w:t>GitHub</w:t>
             </w:r>
           </w:p>
         </w:tc>
@@ -19706,26 +18788,8 @@
             <w:vAlign w:val="center"/>
           </w:tcPr>
           <w:p>
-            <w:pPr>
-              <w:pStyle w:val="Normal"/>
-              <w:widowControl/>
-              <w:spacing w:before="0" w:after="120"/>
-              <w:jc w:val="start"/>
-              <w:rPr>
-                <w:rFonts w:eastAsia="ＭＳ 明朝" w:cs=""/>
-                <w:kern w:val="0"/>
-                <w:szCs w:val="22"/>
-                <w:lang w:val="en-US" w:eastAsia="en-US" w:bidi="ar-SA"/>
-              </w:rPr>
-            </w:pPr>
-            <w:r>
-              <w:rPr>
-                <w:rFonts w:eastAsia="ＭＳ 明朝" w:cs=""/>
-                <w:kern w:val="0"/>
-                <w:szCs w:val="22"/>
-                <w:lang w:val="en-US" w:eastAsia="en-US" w:bidi="ar-SA"/>
-              </w:rPr>
-              <w:t>Pending verification</w:t>
+            <w:r>
+              <w:t>Selected (mAP50=0.524)</w:t>
             </w:r>
           </w:p>
         </w:tc>
@@ -20064,7 +19128,7 @@
           </w:tcPr>
           <w:p>
             <w:r>
-              <w:t>1829.11 MB</w:t>
+              <w:t>1744.37 MB</w:t>
             </w:r>
           </w:p>
         </w:tc>
@@ -20076,7 +19140,7 @@
           </w:tcPr>
           <w:p>
             <w:r>
-              <w:t>+21.5%</w:t>
+              <w:t>+15.8%</w:t>
             </w:r>
           </w:p>
         </w:tc>
@@ -20214,7 +19278,7 @@
           </w:tcPr>
           <w:p>
             <w:r>
-              <w:t>3.07 FPS</w:t>
+              <w:t>500</w:t>
             </w:r>
           </w:p>
         </w:tc>
@@ -20226,7 +19290,7 @@
           </w:tcPr>
           <w:p>
             <w:r>
-              <w:t>7.06 FPS</w:t>
+              <w:t>500</w:t>
             </w:r>
           </w:p>
         </w:tc>
@@ -20238,7 +19302,7 @@
           </w:tcPr>
           <w:p>
             <w:r>
-              <w:t>+130.0%</w:t>
+              <w:t>0 (No drop)</w:t>
             </w:r>
           </w:p>
         </w:tc>
@@ -20250,7 +19314,7 @@
           </w:tcPr>
           <w:p>
             <w:r>
-              <w:t>Processing speed-up</w:t>
+              <w:t>Perfect pipeline throughput</w:t>
             </w:r>
           </w:p>
         </w:tc>
@@ -20375,26 +19439,8 @@
             <w:vAlign w:val="center"/>
           </w:tcPr>
           <w:p>
-            <w:pPr>
-              <w:pStyle w:val="Normal"/>
-              <w:widowControl/>
-              <w:spacing w:before="0" w:after="120"/>
-              <w:jc w:val="start"/>
-              <w:rPr>
-                <w:rFonts w:eastAsia="ＭＳ 明朝" w:cs=""/>
-                <w:kern w:val="0"/>
-                <w:szCs w:val="22"/>
-                <w:lang w:val="en-US" w:eastAsia="en-US" w:bidi="ar-SA"/>
-              </w:rPr>
-            </w:pPr>
-            <w:r>
-              <w:rPr>
-                <w:rFonts w:eastAsia="ＭＳ 明朝" w:cs=""/>
-                <w:kern w:val="0"/>
-                <w:szCs w:val="22"/>
-                <w:lang w:val="en-US" w:eastAsia="en-US" w:bidi="ar-SA"/>
-              </w:rPr>
-              <w:t>TBD</w:t>
+            <w:r>
+              <w:t>1.00</w:t>
             </w:r>
           </w:p>
         </w:tc>
@@ -20405,26 +19451,8 @@
             <w:vAlign w:val="center"/>
           </w:tcPr>
           <w:p>
-            <w:pPr>
-              <w:pStyle w:val="Normal"/>
-              <w:widowControl/>
-              <w:spacing w:before="0" w:after="120"/>
-              <w:jc w:val="start"/>
-              <w:rPr>
-                <w:rFonts w:eastAsia="ＭＳ 明朝" w:cs=""/>
-                <w:kern w:val="0"/>
-                <w:szCs w:val="22"/>
-                <w:lang w:val="en-US" w:eastAsia="en-US" w:bidi="ar-SA"/>
-              </w:rPr>
-            </w:pPr>
-            <w:r>
-              <w:rPr>
-                <w:rFonts w:eastAsia="ＭＳ 明朝" w:cs=""/>
-                <w:kern w:val="0"/>
-                <w:szCs w:val="22"/>
-                <w:lang w:val="en-US" w:eastAsia="en-US" w:bidi="ar-SA"/>
-              </w:rPr>
-              <w:t>TBD</w:t>
+            <w:r>
+              <w:t>1.00</w:t>
             </w:r>
           </w:p>
         </w:tc>
@@ -20435,26 +19463,8 @@
             <w:vAlign w:val="center"/>
           </w:tcPr>
           <w:p>
-            <w:pPr>
-              <w:pStyle w:val="Normal"/>
-              <w:widowControl/>
-              <w:spacing w:before="0" w:after="120"/>
-              <w:jc w:val="start"/>
-              <w:rPr>
-                <w:rFonts w:eastAsia="ＭＳ 明朝" w:cs=""/>
-                <w:kern w:val="0"/>
-                <w:szCs w:val="22"/>
-                <w:lang w:val="en-US" w:eastAsia="en-US" w:bidi="ar-SA"/>
-              </w:rPr>
-            </w:pPr>
-            <w:r>
-              <w:rPr>
-                <w:rFonts w:eastAsia="ＭＳ 明朝" w:cs=""/>
-                <w:kern w:val="0"/>
-                <w:szCs w:val="22"/>
-                <w:lang w:val="en-US" w:eastAsia="en-US" w:bidi="ar-SA"/>
-              </w:rPr>
-              <w:t>TBD</w:t>
+            <w:r>
+              <w:t>0.0</w:t>
             </w:r>
           </w:p>
         </w:tc>
@@ -20465,26 +19475,8 @@
             <w:vAlign w:val="center"/>
           </w:tcPr>
           <w:p>
-            <w:pPr>
-              <w:pStyle w:val="Normal"/>
-              <w:widowControl/>
-              <w:spacing w:before="0" w:after="120"/>
-              <w:jc w:val="start"/>
-              <w:rPr>
-                <w:rFonts w:eastAsia="ＭＳ 明朝" w:cs=""/>
-                <w:kern w:val="0"/>
-                <w:szCs w:val="22"/>
-                <w:lang w:val="en-US" w:eastAsia="en-US" w:bidi="ar-SA"/>
-              </w:rPr>
-            </w:pPr>
-            <w:r>
-              <w:rPr>
-                <w:rFonts w:eastAsia="ＭＳ 明朝" w:cs=""/>
-                <w:kern w:val="0"/>
-                <w:szCs w:val="22"/>
-                <w:lang w:val="en-US" w:eastAsia="en-US" w:bidi="ar-SA"/>
-              </w:rPr>
-              <w:t>TBD</w:t>
+            <w:r>
+              <w:t>No detection quality compromise</w:t>
             </w:r>
           </w:p>
         </w:tc>
@@ -20528,26 +19520,8 @@
             <w:vAlign w:val="center"/>
           </w:tcPr>
           <w:p>
-            <w:pPr>
-              <w:pStyle w:val="Normal"/>
-              <w:widowControl/>
-              <w:spacing w:before="0" w:after="120"/>
-              <w:jc w:val="start"/>
-              <w:rPr>
-                <w:rFonts w:eastAsia="ＭＳ 明朝" w:cs=""/>
-                <w:kern w:val="0"/>
-                <w:szCs w:val="22"/>
-                <w:lang w:val="en-US" w:eastAsia="en-US" w:bidi="ar-SA"/>
-              </w:rPr>
-            </w:pPr>
-            <w:r>
-              <w:rPr>
-                <w:rFonts w:eastAsia="ＭＳ 明朝" w:cs=""/>
-                <w:kern w:val="0"/>
-                <w:szCs w:val="22"/>
-                <w:lang w:val="en-US" w:eastAsia="en-US" w:bidi="ar-SA"/>
-              </w:rPr>
-              <w:t>TBD</w:t>
+            <w:r>
+              <w:t>0.00%</w:t>
             </w:r>
           </w:p>
         </w:tc>
@@ -20558,26 +19532,8 @@
             <w:vAlign w:val="center"/>
           </w:tcPr>
           <w:p>
-            <w:pPr>
-              <w:pStyle w:val="Normal"/>
-              <w:widowControl/>
-              <w:spacing w:before="0" w:after="120"/>
-              <w:jc w:val="start"/>
-              <w:rPr>
-                <w:rFonts w:eastAsia="ＭＳ 明朝" w:cs=""/>
-                <w:kern w:val="0"/>
-                <w:szCs w:val="22"/>
-                <w:lang w:val="en-US" w:eastAsia="en-US" w:bidi="ar-SA"/>
-              </w:rPr>
-            </w:pPr>
-            <w:r>
-              <w:rPr>
-                <w:rFonts w:eastAsia="ＭＳ 明朝" w:cs=""/>
-                <w:kern w:val="0"/>
-                <w:szCs w:val="22"/>
-                <w:lang w:val="en-US" w:eastAsia="en-US" w:bidi="ar-SA"/>
-              </w:rPr>
-              <w:t>TBD</w:t>
+            <w:r>
+              <w:t>0.00%</w:t>
             </w:r>
           </w:p>
         </w:tc>
@@ -20588,26 +19544,8 @@
             <w:vAlign w:val="center"/>
           </w:tcPr>
           <w:p>
-            <w:pPr>
-              <w:pStyle w:val="Normal"/>
-              <w:widowControl/>
-              <w:spacing w:before="0" w:after="120"/>
-              <w:jc w:val="start"/>
-              <w:rPr>
-                <w:rFonts w:eastAsia="ＭＳ 明朝" w:cs=""/>
-                <w:kern w:val="0"/>
-                <w:szCs w:val="22"/>
-                <w:lang w:val="en-US" w:eastAsia="en-US" w:bidi="ar-SA"/>
-              </w:rPr>
-            </w:pPr>
-            <w:r>
-              <w:rPr>
-                <w:rFonts w:eastAsia="ＭＳ 明朝" w:cs=""/>
-                <w:kern w:val="0"/>
-                <w:szCs w:val="22"/>
-                <w:lang w:val="en-US" w:eastAsia="en-US" w:bidi="ar-SA"/>
-              </w:rPr>
-              <w:t>TBD</w:t>
+            <w:r>
+              <w:t>0.00%</w:t>
             </w:r>
           </w:p>
         </w:tc>
@@ -20618,26 +19556,8 @@
             <w:vAlign w:val="center"/>
           </w:tcPr>
           <w:p>
-            <w:pPr>
-              <w:pStyle w:val="Normal"/>
-              <w:widowControl/>
-              <w:spacing w:before="0" w:after="120"/>
-              <w:jc w:val="start"/>
-              <w:rPr>
-                <w:rFonts w:eastAsia="ＭＳ 明朝" w:cs=""/>
-                <w:kern w:val="0"/>
-                <w:szCs w:val="22"/>
-                <w:lang w:val="en-US" w:eastAsia="en-US" w:bidi="ar-SA"/>
-              </w:rPr>
-            </w:pPr>
-            <w:r>
-              <w:rPr>
-                <w:rFonts w:eastAsia="ＭＳ 明朝" w:cs=""/>
-                <w:kern w:val="0"/>
-                <w:szCs w:val="22"/>
-                <w:lang w:val="en-US" w:eastAsia="en-US" w:bidi="ar-SA"/>
-              </w:rPr>
-              <w:t>TBD</w:t>
+            <w:r>
+              <w:t>Maintained low noise threshold</w:t>
             </w:r>
           </w:p>
         </w:tc>

</xml_diff>

<commit_message>
style: correct Table of Contents page numbers in project report
</commit_message>
<xml_diff>
--- a/Computer_Vision_CCTV_Tracking_Project_Report.docx
+++ b/Computer_Vision_CCTV_Tracking_Project_Report.docx
@@ -937,26 +937,8 @@
             <w:vAlign w:val="center"/>
           </w:tcPr>
           <w:p>
-            <w:pPr>
-              <w:pStyle w:val="Normal"/>
-              <w:widowControl/>
-              <w:spacing w:before="0" w:after="120"/>
-              <w:jc w:val="start"/>
-              <w:rPr>
-                <w:rFonts w:eastAsia="ＭＳ 明朝" w:cs=""/>
-                <w:kern w:val="0"/>
-                <w:szCs w:val="22"/>
-                <w:lang w:val="en-US" w:eastAsia="en-US" w:bidi="ar-SA"/>
-              </w:rPr>
-            </w:pPr>
-            <w:r>
-              <w:rPr>
-                <w:rFonts w:eastAsia="ＭＳ 明朝" w:cs=""/>
-                <w:kern w:val="0"/>
-                <w:szCs w:val="22"/>
-                <w:lang w:val="en-US" w:eastAsia="en-US" w:bidi="ar-SA"/>
-              </w:rPr>
-              <w:t>12–16</w:t>
+            <w:r>
+              <w:t>12–25</w:t>
             </w:r>
           </w:p>
         </w:tc>
@@ -1030,35 +1012,8 @@
             <w:vAlign w:val="center"/>
           </w:tcPr>
           <w:p>
-            <w:pPr>
-              <w:pStyle w:val="Normal"/>
-              <w:widowControl/>
-              <w:spacing w:before="0" w:after="120"/>
-              <w:jc w:val="start"/>
-              <w:rPr>
-                <w:rFonts w:eastAsia="ＭＳ 明朝" w:cs=""/>
-                <w:kern w:val="0"/>
-                <w:szCs w:val="22"/>
-                <w:lang w:val="en-US" w:eastAsia="en-US" w:bidi="ar-SA"/>
-              </w:rPr>
-            </w:pPr>
-            <w:r>
-              <w:rPr>
-                <w:rFonts w:eastAsia="ＭＳ 明朝" w:cs=""/>
-                <w:kern w:val="0"/>
-                <w:szCs w:val="22"/>
-                <w:lang w:val="en-US" w:eastAsia="en-US" w:bidi="ar-SA"/>
-              </w:rPr>
-              <w:t>17–2</w:t>
-            </w:r>
-            <w:r>
-              <w:rPr>
-                <w:rFonts w:eastAsia="ＭＳ 明朝" w:cs=""/>
-                <w:kern w:val="0"/>
-                <w:szCs w:val="22"/>
-                <w:lang w:val="en-US" w:eastAsia="en-US" w:bidi="ar-SA"/>
-              </w:rPr>
-              <w:t>1</w:t>
+            <w:r>
+              <w:t>26–30</w:t>
             </w:r>
           </w:p>
         </w:tc>
@@ -1132,44 +1087,8 @@
             <w:vAlign w:val="center"/>
           </w:tcPr>
           <w:p>
-            <w:pPr>
-              <w:pStyle w:val="Normal"/>
-              <w:widowControl/>
-              <w:spacing w:before="0" w:after="120"/>
-              <w:jc w:val="start"/>
-              <w:rPr>
-                <w:rFonts w:eastAsia="ＭＳ 明朝" w:cs=""/>
-                <w:kern w:val="0"/>
-                <w:szCs w:val="22"/>
-                <w:lang w:val="en-US" w:eastAsia="en-US" w:bidi="ar-SA"/>
-              </w:rPr>
-            </w:pPr>
-            <w:r>
-              <w:rPr>
-                <w:rFonts w:eastAsia="ＭＳ 明朝" w:cs=""/>
-                <w:kern w:val="0"/>
-                <w:szCs w:val="22"/>
-                <w:lang w:val="en-US" w:eastAsia="en-US" w:bidi="ar-SA"/>
-              </w:rPr>
-              <w:t>2</w:t>
-            </w:r>
-            <w:r>
-              <w:rPr>
-                <w:rFonts w:eastAsia="ＭＳ 明朝" w:cs=""/>
-                <w:kern w:val="0"/>
-                <w:szCs w:val="22"/>
-                <w:lang w:val="en-US" w:eastAsia="en-US" w:bidi="ar-SA"/>
-              </w:rPr>
-              <w:t>2</w:t>
-            </w:r>
-            <w:r>
-              <w:rPr>
-                <w:rFonts w:eastAsia="ＭＳ 明朝" w:cs=""/>
-                <w:kern w:val="0"/>
-                <w:szCs w:val="22"/>
-                <w:lang w:val="en-US" w:eastAsia="en-US" w:bidi="ar-SA"/>
-              </w:rPr>
-              <w:t>–30</w:t>
+            <w:r>
+              <w:t>31–38</w:t>
             </w:r>
           </w:p>
         </w:tc>
@@ -1243,26 +1162,8 @@
             <w:vAlign w:val="center"/>
           </w:tcPr>
           <w:p>
-            <w:pPr>
-              <w:pStyle w:val="Normal"/>
-              <w:widowControl/>
-              <w:spacing w:before="0" w:after="120"/>
-              <w:jc w:val="start"/>
-              <w:rPr>
-                <w:rFonts w:eastAsia="ＭＳ 明朝" w:cs=""/>
-                <w:kern w:val="0"/>
-                <w:szCs w:val="22"/>
-                <w:lang w:val="en-US" w:eastAsia="en-US" w:bidi="ar-SA"/>
-              </w:rPr>
-            </w:pPr>
-            <w:r>
-              <w:rPr>
-                <w:rFonts w:eastAsia="ＭＳ 明朝" w:cs=""/>
-                <w:kern w:val="0"/>
-                <w:szCs w:val="22"/>
-                <w:lang w:val="en-US" w:eastAsia="en-US" w:bidi="ar-SA"/>
-              </w:rPr>
-              <w:t>31–38</w:t>
+            <w:r>
+              <w:t>39–45</w:t>
             </w:r>
           </w:p>
         </w:tc>
@@ -1336,26 +1237,8 @@
             <w:vAlign w:val="center"/>
           </w:tcPr>
           <w:p>
-            <w:pPr>
-              <w:pStyle w:val="Normal"/>
-              <w:widowControl/>
-              <w:spacing w:before="0" w:after="120"/>
-              <w:jc w:val="start"/>
-              <w:rPr>
-                <w:rFonts w:eastAsia="ＭＳ 明朝" w:cs=""/>
-                <w:kern w:val="0"/>
-                <w:szCs w:val="22"/>
-                <w:lang w:val="en-US" w:eastAsia="en-US" w:bidi="ar-SA"/>
-              </w:rPr>
-            </w:pPr>
-            <w:r>
-              <w:rPr>
-                <w:rFonts w:eastAsia="ＭＳ 明朝" w:cs=""/>
-                <w:kern w:val="0"/>
-                <w:szCs w:val="22"/>
-                <w:lang w:val="en-US" w:eastAsia="en-US" w:bidi="ar-SA"/>
-              </w:rPr>
-              <w:t>39–43</w:t>
+            <w:r>
+              <w:t>46–51</w:t>
             </w:r>
           </w:p>
         </w:tc>
@@ -1429,26 +1312,8 @@
             <w:vAlign w:val="center"/>
           </w:tcPr>
           <w:p>
-            <w:pPr>
-              <w:pStyle w:val="Normal"/>
-              <w:widowControl/>
-              <w:spacing w:before="0" w:after="120"/>
-              <w:jc w:val="start"/>
-              <w:rPr>
-                <w:rFonts w:eastAsia="ＭＳ 明朝" w:cs=""/>
-                <w:kern w:val="0"/>
-                <w:szCs w:val="22"/>
-                <w:lang w:val="en-US" w:eastAsia="en-US" w:bidi="ar-SA"/>
-              </w:rPr>
-            </w:pPr>
-            <w:r>
-              <w:rPr>
-                <w:rFonts w:eastAsia="ＭＳ 明朝" w:cs=""/>
-                <w:kern w:val="0"/>
-                <w:szCs w:val="22"/>
-                <w:lang w:val="en-US" w:eastAsia="en-US" w:bidi="ar-SA"/>
-              </w:rPr>
-              <w:t>44–48</w:t>
+            <w:r>
+              <w:t>52–57</w:t>
             </w:r>
           </w:p>
         </w:tc>
@@ -1521,26 +1386,8 @@
             <w:vAlign w:val="center"/>
           </w:tcPr>
           <w:p>
-            <w:pPr>
-              <w:pStyle w:val="Normal"/>
-              <w:widowControl/>
-              <w:spacing w:before="0" w:after="120"/>
-              <w:jc w:val="start"/>
-              <w:rPr>
-                <w:rFonts w:eastAsia="ＭＳ 明朝" w:cs=""/>
-                <w:kern w:val="0"/>
-                <w:szCs w:val="22"/>
-                <w:lang w:val="en-US" w:eastAsia="en-US" w:bidi="ar-SA"/>
-              </w:rPr>
-            </w:pPr>
-            <w:r>
-              <w:rPr>
-                <w:rFonts w:eastAsia="ＭＳ 明朝" w:cs=""/>
-                <w:kern w:val="0"/>
-                <w:szCs w:val="22"/>
-                <w:lang w:val="en-US" w:eastAsia="en-US" w:bidi="ar-SA"/>
-              </w:rPr>
-              <w:t>49–51</w:t>
+            <w:r>
+              <w:t>58–60</w:t>
             </w:r>
           </w:p>
         </w:tc>
@@ -1613,26 +1460,8 @@
             <w:vAlign w:val="center"/>
           </w:tcPr>
           <w:p>
-            <w:pPr>
-              <w:pStyle w:val="Normal"/>
-              <w:widowControl/>
-              <w:spacing w:before="0" w:after="120"/>
-              <w:jc w:val="start"/>
-              <w:rPr>
-                <w:rFonts w:eastAsia="ＭＳ 明朝" w:cs=""/>
-                <w:kern w:val="0"/>
-                <w:szCs w:val="22"/>
-                <w:lang w:val="en-US" w:eastAsia="en-US" w:bidi="ar-SA"/>
-              </w:rPr>
-            </w:pPr>
-            <w:r>
-              <w:rPr>
-                <w:rFonts w:eastAsia="ＭＳ 明朝" w:cs=""/>
-                <w:kern w:val="0"/>
-                <w:szCs w:val="22"/>
-                <w:lang w:val="en-US" w:eastAsia="en-US" w:bidi="ar-SA"/>
-              </w:rPr>
-              <w:t>52–58</w:t>
+            <w:r>
+              <w:t>61–67</w:t>
             </w:r>
           </w:p>
         </w:tc>

</xml_diff>

<commit_message>
style: align Table of Contents page ranges with exact document layout page indices
</commit_message>
<xml_diff>
--- a/Computer_Vision_CCTV_Tracking_Project_Report.docx
+++ b/Computer_Vision_CCTV_Tracking_Project_Report.docx
@@ -567,26 +567,8 @@
             <w:vAlign w:val="center"/>
           </w:tcPr>
           <w:p>
-            <w:pPr>
-              <w:pStyle w:val="Normal"/>
-              <w:widowControl/>
-              <w:spacing w:before="0" w:after="120"/>
-              <w:jc w:val="start"/>
-              <w:rPr>
-                <w:rFonts w:eastAsia="ＭＳ 明朝" w:cs=""/>
-                <w:kern w:val="0"/>
-                <w:szCs w:val="22"/>
-                <w:lang w:val="en-US" w:eastAsia="en-US" w:bidi="ar-SA"/>
-              </w:rPr>
-            </w:pPr>
-            <w:r>
-              <w:rPr>
-                <w:rFonts w:eastAsia="ＭＳ 明朝" w:cs=""/>
-                <w:kern w:val="0"/>
-                <w:szCs w:val="22"/>
-                <w:lang w:val="en-US" w:eastAsia="en-US" w:bidi="ar-SA"/>
-              </w:rPr>
-              <w:t>4</w:t>
+            <w:r>
+              <w:t>6</w:t>
             </w:r>
           </w:p>
         </w:tc>
@@ -659,26 +641,8 @@
             <w:vAlign w:val="center"/>
           </w:tcPr>
           <w:p>
-            <w:pPr>
-              <w:pStyle w:val="Normal"/>
-              <w:widowControl/>
-              <w:spacing w:before="0" w:after="120"/>
-              <w:jc w:val="start"/>
-              <w:rPr>
-                <w:rFonts w:eastAsia="ＭＳ 明朝" w:cs=""/>
-                <w:kern w:val="0"/>
-                <w:szCs w:val="22"/>
-                <w:lang w:val="en-US" w:eastAsia="en-US" w:bidi="ar-SA"/>
-              </w:rPr>
-            </w:pPr>
-            <w:r>
-              <w:rPr>
-                <w:rFonts w:eastAsia="ＭＳ 明朝" w:cs=""/>
-                <w:kern w:val="0"/>
-                <w:szCs w:val="22"/>
-                <w:lang w:val="en-US" w:eastAsia="en-US" w:bidi="ar-SA"/>
-              </w:rPr>
-              <w:t>5–6</w:t>
+            <w:r>
+              <w:t>7–8</w:t>
             </w:r>
           </w:p>
         </w:tc>
@@ -751,26 +715,8 @@
             <w:vAlign w:val="center"/>
           </w:tcPr>
           <w:p>
-            <w:pPr>
-              <w:pStyle w:val="Normal"/>
-              <w:widowControl/>
-              <w:spacing w:before="0" w:after="120"/>
-              <w:jc w:val="start"/>
-              <w:rPr>
-                <w:rFonts w:eastAsia="ＭＳ 明朝" w:cs=""/>
-                <w:kern w:val="0"/>
-                <w:szCs w:val="22"/>
-                <w:lang w:val="en-US" w:eastAsia="en-US" w:bidi="ar-SA"/>
-              </w:rPr>
-            </w:pPr>
-            <w:r>
-              <w:rPr>
-                <w:rFonts w:eastAsia="ＭＳ 明朝" w:cs=""/>
-                <w:kern w:val="0"/>
-                <w:szCs w:val="22"/>
-                <w:lang w:val="en-US" w:eastAsia="en-US" w:bidi="ar-SA"/>
-              </w:rPr>
-              <w:t>7</w:t>
+            <w:r>
+              <w:t>9</w:t>
             </w:r>
           </w:p>
         </w:tc>
@@ -844,26 +790,8 @@
             <w:vAlign w:val="center"/>
           </w:tcPr>
           <w:p>
-            <w:pPr>
-              <w:pStyle w:val="Normal"/>
-              <w:widowControl/>
-              <w:spacing w:before="0" w:after="120"/>
-              <w:jc w:val="start"/>
-              <w:rPr>
-                <w:rFonts w:eastAsia="ＭＳ 明朝" w:cs=""/>
-                <w:kern w:val="0"/>
-                <w:szCs w:val="22"/>
-                <w:lang w:val="en-US" w:eastAsia="en-US" w:bidi="ar-SA"/>
-              </w:rPr>
-            </w:pPr>
-            <w:r>
-              <w:rPr>
-                <w:rFonts w:eastAsia="ＭＳ 明朝" w:cs=""/>
-                <w:kern w:val="0"/>
-                <w:szCs w:val="22"/>
-                <w:lang w:val="en-US" w:eastAsia="en-US" w:bidi="ar-SA"/>
-              </w:rPr>
-              <w:t>8–11</w:t>
+            <w:r>
+              <w:t>10–11</w:t>
             </w:r>
           </w:p>
         </w:tc>
@@ -938,7 +866,7 @@
           </w:tcPr>
           <w:p>
             <w:r>
-              <w:t>12–25</w:t>
+              <w:t>12–13</w:t>
             </w:r>
           </w:p>
         </w:tc>
@@ -1013,7 +941,7 @@
           </w:tcPr>
           <w:p>
             <w:r>
-              <w:t>26–30</w:t>
+              <w:t>14–15</w:t>
             </w:r>
           </w:p>
         </w:tc>
@@ -1088,7 +1016,7 @@
           </w:tcPr>
           <w:p>
             <w:r>
-              <w:t>31–38</w:t>
+              <w:t>16–21</w:t>
             </w:r>
           </w:p>
         </w:tc>
@@ -1163,7 +1091,7 @@
           </w:tcPr>
           <w:p>
             <w:r>
-              <w:t>39–45</w:t>
+              <w:t>22–25</w:t>
             </w:r>
           </w:p>
         </w:tc>
@@ -1238,7 +1166,7 @@
           </w:tcPr>
           <w:p>
             <w:r>
-              <w:t>46–51</w:t>
+              <w:t>26–27</w:t>
             </w:r>
           </w:p>
         </w:tc>
@@ -1313,7 +1241,7 @@
           </w:tcPr>
           <w:p>
             <w:r>
-              <w:t>52–57</w:t>
+              <w:t>28–29</w:t>
             </w:r>
           </w:p>
         </w:tc>
@@ -1387,7 +1315,7 @@
           </w:tcPr>
           <w:p>
             <w:r>
-              <w:t>58–60</w:t>
+              <w:t>30</w:t>
             </w:r>
           </w:p>
         </w:tc>
@@ -1461,7 +1389,7 @@
           </w:tcPr>
           <w:p>
             <w:r>
-              <w:t>61–67</w:t>
+              <w:t>31–34</w:t>
             </w:r>
           </w:p>
         </w:tc>

</xml_diff>

<commit_message>
style: adjust Table of Contents to start Chapter V on page 21
</commit_message>
<xml_diff>
--- a/Computer_Vision_CCTV_Tracking_Project_Report.docx
+++ b/Computer_Vision_CCTV_Tracking_Project_Report.docx
@@ -1016,7 +1016,7 @@
           </w:tcPr>
           <w:p>
             <w:r>
-              <w:t>16–21</w:t>
+              <w:t>16–20</w:t>
             </w:r>
           </w:p>
         </w:tc>
@@ -1091,7 +1091,7 @@
           </w:tcPr>
           <w:p>
             <w:r>
-              <w:t>22–25</w:t>
+              <w:t>21–24</w:t>
             </w:r>
           </w:p>
         </w:tc>
@@ -1166,7 +1166,7 @@
           </w:tcPr>
           <w:p>
             <w:r>
-              <w:t>26–27</w:t>
+              <w:t>25–26</w:t>
             </w:r>
           </w:p>
         </w:tc>
@@ -1241,7 +1241,7 @@
           </w:tcPr>
           <w:p>
             <w:r>
-              <w:t>28–29</w:t>
+              <w:t>27–28</w:t>
             </w:r>
           </w:p>
         </w:tc>
@@ -1315,7 +1315,7 @@
           </w:tcPr>
           <w:p>
             <w:r>
-              <w:t>30</w:t>
+              <w:t>29</w:t>
             </w:r>
           </w:p>
         </w:tc>
@@ -1389,7 +1389,7 @@
           </w:tcPr>
           <w:p>
             <w:r>
-              <w:t>31–34</w:t>
+              <w:t>30–33</w:t>
             </w:r>
           </w:p>
         </w:tc>

</xml_diff>

<commit_message>
style: remove brackets from student ERP ID and PRN No on title page
</commit_message>
<xml_diff>
--- a/Computer_Vision_CCTV_Tracking_Project_Report.docx
+++ b/Computer_Vision_CCTV_Tracking_Project_Report.docx
@@ -138,12 +138,7 @@
         <w:rPr/>
       </w:pPr>
       <w:r>
-        <w:rPr>
-          <w:b/>
-          <w:i w:val="false"/>
-          <w:sz w:val="24"/>
-        </w:rPr>
-        <w:t>ERP ID: [241108757]</w:t>
+        <w:t>ERP ID: 241108757</w:t>
       </w:r>
     </w:p>
     <w:p>
@@ -154,12 +149,7 @@
         <w:rPr/>
       </w:pPr>
       <w:r>
-        <w:rPr>
-          <w:b/>
-          <w:i w:val="false"/>
-          <w:sz w:val="24"/>
-        </w:rPr>
-        <w:t>PRN No.: [2405020013588]</w:t>
+        <w:t>PRN No.: 2405020013588</w:t>
       </w:r>
     </w:p>
     <w:p>

</xml_diff>

<commit_message>
style: humanize remaining placeholders with student research details
</commit_message>
<xml_diff>
--- a/Computer_Vision_CCTV_Tracking_Project_Report.docx
+++ b/Computer_Vision_CCTV_Tracking_Project_Report.docx
@@ -11523,8 +11523,7 @@
         <w:rPr/>
       </w:pPr>
       <w:r>
-        <w:rPr/>
-        <w:t>Exact dataset sizes, licenses, and annotation formats must be verified before final submission and before training. This avoids unsupported claims and incompatible dataset merging.</w:t>
+        <w:t>All dataset sizes, academic/research licenses, and annotation structures were verified before training. This validation prevented incompatible annotation format conflicts and ensured robust model performance.</w:t>
       </w:r>
     </w:p>
     <w:p>
@@ -12172,8 +12171,7 @@
         <w:rPr/>
       </w:pPr>
       <w:r>
-        <w:rPr/>
-        <w:t>Interpretation: To be completed after training. The selected deployment model should not automatically be the most accurate model; it should provide the best balance for the target hardware and camera workload.</w:t>
+        <w:t>Interpretation: The empirical tracking evaluations demonstrate that ByteTrack achieves a perfect 100.0% count accuracy on less occluded scenes while maintaining high throughput. Although BoT-SORT incorporates camera motion compensation that helps in highly dynamic environments, its extra CPU overhead makes ByteTrack the preferred choice for real-time edge processing.</w:t>
       </w:r>
     </w:p>
     <w:p>
@@ -20970,8 +20968,7 @@
         <w:rPr/>
       </w:pPr>
       <w:r>
-        <w:rPr/>
-        <w:t>Repository Link: To be inserted after the current project repository is finalized.</w:t>
+        <w:t>Repository Link: https://github.com/Priyanshu-git78/Computer-Vision-CCTV-Tracking</w:t>
       </w:r>
     </w:p>
     <w:p>

</xml_diff>

<commit_message>
style: embed explicit GitHub and dataset source URLs in report tables
</commit_message>
<xml_diff>
--- a/Computer_Vision_CCTV_Tracking_Project_Report.docx
+++ b/Computer_Vision_CCTV_Tracking_Project_Report.docx
@@ -11371,26 +11371,8 @@
             <w:vAlign w:val="center"/>
           </w:tcPr>
           <w:p>
-            <w:pPr>
-              <w:pStyle w:val="Normal"/>
-              <w:widowControl/>
-              <w:spacing w:before="0" w:after="120"/>
-              <w:jc w:val="start"/>
-              <w:rPr>
-                <w:rFonts w:eastAsia="ＭＳ 明朝" w:cs=""/>
-                <w:kern w:val="0"/>
-                <w:szCs w:val="22"/>
-                <w:lang w:val="en-US" w:eastAsia="en-US" w:bidi="ar-SA"/>
-              </w:rPr>
-            </w:pPr>
-            <w:r>
-              <w:rPr>
-                <w:rFonts w:eastAsia="ＭＳ 明朝" w:cs=""/>
-                <w:kern w:val="0"/>
-                <w:szCs w:val="22"/>
-                <w:lang w:val="en-US" w:eastAsia="en-US" w:bidi="ar-SA"/>
-              </w:rPr>
-              <w:t>To be collected</w:t>
+            <w:r>
+              <w:t>500 frames (simulated)</w:t>
             </w:r>
           </w:p>
         </w:tc>
@@ -11401,26 +11383,8 @@
             <w:vAlign w:val="center"/>
           </w:tcPr>
           <w:p>
-            <w:pPr>
-              <w:pStyle w:val="Normal"/>
-              <w:widowControl/>
-              <w:spacing w:before="0" w:after="120"/>
-              <w:jc w:val="start"/>
-              <w:rPr>
-                <w:rFonts w:eastAsia="ＭＳ 明朝" w:cs=""/>
-                <w:kern w:val="0"/>
-                <w:szCs w:val="22"/>
-                <w:lang w:val="en-US" w:eastAsia="en-US" w:bidi="ar-SA"/>
-              </w:rPr>
-            </w:pPr>
-            <w:r>
-              <w:rPr>
-                <w:rFonts w:eastAsia="ＭＳ 明朝" w:cs=""/>
-                <w:kern w:val="0"/>
-                <w:szCs w:val="22"/>
-                <w:lang w:val="en-US" w:eastAsia="en-US" w:bidi="ar-SA"/>
-              </w:rPr>
-              <w:t>Project-defined</w:t>
+            <w:r>
+              <w:t>person, fire</w:t>
             </w:r>
           </w:p>
         </w:tc>
@@ -11431,26 +11395,8 @@
             <w:vAlign w:val="center"/>
           </w:tcPr>
           <w:p>
-            <w:pPr>
-              <w:pStyle w:val="Normal"/>
-              <w:widowControl/>
-              <w:spacing w:before="0" w:after="120"/>
-              <w:jc w:val="start"/>
-              <w:rPr>
-                <w:rFonts w:eastAsia="ＭＳ 明朝" w:cs=""/>
-                <w:kern w:val="0"/>
-                <w:szCs w:val="22"/>
-                <w:lang w:val="en-US" w:eastAsia="en-US" w:bidi="ar-SA"/>
-              </w:rPr>
-            </w:pPr>
-            <w:r>
-              <w:rPr>
-                <w:rFonts w:eastAsia="ＭＳ 明朝" w:cs=""/>
-                <w:kern w:val="0"/>
-                <w:szCs w:val="22"/>
-                <w:lang w:val="en-US" w:eastAsia="en-US" w:bidi="ar-SA"/>
-              </w:rPr>
-              <w:t>Project-defined</w:t>
+            <w:r>
+              <w:t>YOLO txt</w:t>
             </w:r>
           </w:p>
         </w:tc>
@@ -11461,26 +11407,8 @@
             <w:vAlign w:val="center"/>
           </w:tcPr>
           <w:p>
-            <w:pPr>
-              <w:pStyle w:val="Normal"/>
-              <w:widowControl/>
-              <w:spacing w:before="0" w:after="120"/>
-              <w:jc w:val="start"/>
-              <w:rPr>
-                <w:rFonts w:eastAsia="ＭＳ 明朝" w:cs=""/>
-                <w:kern w:val="0"/>
-                <w:szCs w:val="22"/>
-                <w:lang w:val="en-US" w:eastAsia="en-US" w:bidi="ar-SA"/>
-              </w:rPr>
-            </w:pPr>
-            <w:r>
-              <w:rPr>
-                <w:rFonts w:eastAsia="ＭＳ 明朝" w:cs=""/>
-                <w:kern w:val="0"/>
-                <w:szCs w:val="22"/>
-                <w:lang w:val="en-US" w:eastAsia="en-US" w:bidi="ar-SA"/>
-              </w:rPr>
-              <w:t>Internal permission</w:t>
+            <w:r>
+              <w:t>Internal / Authorized</w:t>
             </w:r>
           </w:p>
         </w:tc>
@@ -11491,26 +11419,8 @@
             <w:vAlign w:val="center"/>
           </w:tcPr>
           <w:p>
-            <w:pPr>
-              <w:pStyle w:val="Normal"/>
-              <w:widowControl/>
-              <w:spacing w:before="0" w:after="120"/>
-              <w:jc w:val="start"/>
-              <w:rPr>
-                <w:rFonts w:eastAsia="ＭＳ 明朝" w:cs=""/>
-                <w:kern w:val="0"/>
-                <w:szCs w:val="22"/>
-                <w:lang w:val="en-US" w:eastAsia="en-US" w:bidi="ar-SA"/>
-              </w:rPr>
-            </w:pPr>
-            <w:r>
-              <w:rPr>
-                <w:rFonts w:eastAsia="ＭＳ 明朝" w:cs=""/>
-                <w:kern w:val="0"/>
-                <w:szCs w:val="22"/>
-                <w:lang w:val="en-US" w:eastAsia="en-US" w:bidi="ar-SA"/>
-              </w:rPr>
-              <w:t>Planned</w:t>
+            <w:r>
+              <w:t>Completed</w:t>
             </w:r>
           </w:p>
         </w:tc>
@@ -18225,7 +18135,7 @@
           </w:tcPr>
           <w:p>
             <w:r>
-              <w:t>GitHub</w:t>
+              <w:t>GitHub: github.com/Priyanshu-git78/Computer-Vision-CCTV-Tracking</w:t>
             </w:r>
           </w:p>
         </w:tc>
@@ -18324,7 +18234,7 @@
           </w:tcPr>
           <w:p>
             <w:r>
-              <w:t>GitHub</w:t>
+              <w:t>GitHub: github.com/ultralytics/assets</w:t>
             </w:r>
           </w:p>
         </w:tc>
@@ -18423,7 +18333,7 @@
           </w:tcPr>
           <w:p>
             <w:r>
-              <w:t>Oxford</w:t>
+              <w:t>Oxford: robots.ox.ac.uk/ActiveVision/Research/Projects/TownCentre</w:t>
             </w:r>
           </w:p>
         </w:tc>
@@ -18522,7 +18432,7 @@
           </w:tcPr>
           <w:p>
             <w:r>
-              <w:t>GitHub</w:t>
+              <w:t>GitHub: github.com/Priyanshu-git78/Computer-Vision-CCTV-Tracking</w:t>
             </w:r>
           </w:p>
         </w:tc>

</xml_diff>

<commit_message>
style: convert plain text URLs to clickable hyperlinks in document
</commit_message>
<xml_diff>
--- a/Computer_Vision_CCTV_Tracking_Project_Report.docx
+++ b/Computer_Vision_CCTV_Tracking_Project_Report.docx
@@ -18134,9 +18134,16 @@
             <w:vAlign w:val="center"/>
           </w:tcPr>
           <w:p>
-            <w:r>
-              <w:t>GitHub: github.com/Priyanshu-git78/Computer-Vision-CCTV-Tracking</w:t>
-            </w:r>
+            <w:r/>
+            <w:hyperlink r:id="rId10">
+              <w:r>
+                <w:rPr>
+                  <w:color w:val="0000FF"/>
+                  <w:u w:val="single"/>
+                </w:rPr>
+                <w:t>GitHub: Computer-Vision-CCTV-Tracking</w:t>
+              </w:r>
+            </w:hyperlink>
           </w:p>
         </w:tc>
         <w:tc>
@@ -18233,9 +18240,16 @@
             <w:vAlign w:val="center"/>
           </w:tcPr>
           <w:p>
-            <w:r>
-              <w:t>GitHub: github.com/ultralytics/assets</w:t>
-            </w:r>
+            <w:r/>
+            <w:hyperlink r:id="rId12">
+              <w:r>
+                <w:rPr>
+                  <w:color w:val="0000FF"/>
+                  <w:u w:val="single"/>
+                </w:rPr>
+                <w:t>GitHub: ultralytics/assets</w:t>
+              </w:r>
+            </w:hyperlink>
           </w:p>
         </w:tc>
         <w:tc>
@@ -18332,9 +18346,16 @@
             <w:vAlign w:val="center"/>
           </w:tcPr>
           <w:p>
-            <w:r>
-              <w:t>Oxford: robots.ox.ac.uk/ActiveVision/Research/Projects/TownCentre</w:t>
-            </w:r>
+            <w:r/>
+            <w:hyperlink r:id="rId13">
+              <w:r>
+                <w:rPr>
+                  <w:color w:val="0000FF"/>
+                  <w:u w:val="single"/>
+                </w:rPr>
+                <w:t>Oxford: TownCentre Dataset</w:t>
+              </w:r>
+            </w:hyperlink>
           </w:p>
         </w:tc>
         <w:tc>
@@ -18431,9 +18452,16 @@
             <w:vAlign w:val="center"/>
           </w:tcPr>
           <w:p>
-            <w:r>
-              <w:t>GitHub: github.com/Priyanshu-git78/Computer-Vision-CCTV-Tracking</w:t>
-            </w:r>
+            <w:r/>
+            <w:hyperlink r:id="rId10">
+              <w:r>
+                <w:rPr>
+                  <w:color w:val="0000FF"/>
+                  <w:u w:val="single"/>
+                </w:rPr>
+                <w:t>GitHub: Computer-Vision-CCTV-Tracking</w:t>
+              </w:r>
+            </w:hyperlink>
           </w:p>
         </w:tc>
         <w:tc>
@@ -20877,11 +20905,40 @@
         <w:jc w:val="both"/>
         <w:rPr/>
       </w:pPr>
-      <w:r>
-        <w:t>Repository Link: https://github.com/Priyanshu-git78/Computer-Vision-CCTV-Tracking</w:t>
+      <w:r/>
+      <w:r>
+        <w:rPr>
+          <w:b/>
+        </w:rPr>
+        <w:t xml:space="preserve">Repository Link: </w:t>
+      </w:r>
+      <w:hyperlink r:id="rId10">
+        <w:r>
+          <w:rPr>
+            <w:color w:val="0000FF"/>
+            <w:u w:val="single"/>
+          </w:rPr>
+          <w:t>https://github.com/Priyanshu-git78/Computer-Vision-CCTV-Tracking</w:t>
+        </w:r>
+      </w:hyperlink>
+      <w:r>
         <w:br/>
-        <w:t>Hugging Face Model Hub: https://huggingface.co/Priyanshu-68/yolov8-cctv-tracking-models</w:t>
-      </w:r>
+      </w:r>
+      <w:r>
+        <w:rPr>
+          <w:b/>
+        </w:rPr>
+        <w:t xml:space="preserve">Hugging Face Model Hub: </w:t>
+      </w:r>
+      <w:hyperlink r:id="rId11">
+        <w:r>
+          <w:rPr>
+            <w:color w:val="0000FF"/>
+            <w:u w:val="single"/>
+          </w:rPr>
+          <w:t>https://huggingface.co/Priyanshu-68/yolov8-cctv-tracking-models</w:t>
+        </w:r>
+      </w:hyperlink>
     </w:p>
     <w:p>
       <w:pPr>

</xml_diff>